<commit_message>
implementation et mise a jour de la fonctionnalite des paiement mobile money- 2
</commit_message>
<xml_diff>
--- a/Docs/cahier-des-charges-E-TONTINE.docx
+++ b/Docs/cahier-des-charges-E-TONTINE.docx
@@ -31,11 +31,7 @@
       </w:pPr>
       <w:r>
         <w:rPr/>
-        <w:t>I.</w:t>
-      </w:r>
-      <w:r>
-        <w:rPr/>
-        <w:t>Introduction</w:t>
+        <w:t>I.Introduction</w:t>
       </w:r>
     </w:p>
     <w:p>
@@ -207,7 +203,7 @@
         <w:pStyle w:val="ListParagraph"/>
         <w:numPr>
           <w:ilvl w:val="0"/>
-          <w:numId w:val="3"/>
+          <w:numId w:val="4"/>
         </w:numPr>
         <w:spacing w:before="0" w:after="80"/>
         <w:rPr/>
@@ -222,7 +218,7 @@
         <w:pStyle w:val="ListParagraph"/>
         <w:numPr>
           <w:ilvl w:val="0"/>
-          <w:numId w:val="1"/>
+          <w:numId w:val="2"/>
         </w:numPr>
         <w:spacing w:before="0" w:after="80"/>
         <w:rPr/>
@@ -237,7 +233,7 @@
         <w:pStyle w:val="ListParagraph"/>
         <w:numPr>
           <w:ilvl w:val="0"/>
-          <w:numId w:val="1"/>
+          <w:numId w:val="2"/>
         </w:numPr>
         <w:spacing w:before="0" w:after="80"/>
         <w:rPr/>
@@ -252,7 +248,7 @@
         <w:pStyle w:val="ListParagraph"/>
         <w:numPr>
           <w:ilvl w:val="0"/>
-          <w:numId w:val="1"/>
+          <w:numId w:val="2"/>
         </w:numPr>
         <w:spacing w:before="0" w:after="80"/>
         <w:rPr/>
@@ -267,7 +263,7 @@
         <w:pStyle w:val="ListParagraph"/>
         <w:numPr>
           <w:ilvl w:val="0"/>
-          <w:numId w:val="1"/>
+          <w:numId w:val="2"/>
         </w:numPr>
         <w:spacing w:before="0" w:after="80"/>
         <w:rPr/>
@@ -282,7 +278,7 @@
         <w:pStyle w:val="ListParagraph"/>
         <w:numPr>
           <w:ilvl w:val="0"/>
-          <w:numId w:val="1"/>
+          <w:numId w:val="2"/>
         </w:numPr>
         <w:spacing w:before="0" w:after="80"/>
         <w:rPr/>
@@ -297,7 +293,7 @@
         <w:pStyle w:val="ListParagraph"/>
         <w:numPr>
           <w:ilvl w:val="0"/>
-          <w:numId w:val="1"/>
+          <w:numId w:val="2"/>
         </w:numPr>
         <w:spacing w:before="0" w:after="80"/>
         <w:rPr/>
@@ -312,7 +308,7 @@
         <w:pStyle w:val="ListParagraph"/>
         <w:numPr>
           <w:ilvl w:val="0"/>
-          <w:numId w:val="1"/>
+          <w:numId w:val="2"/>
         </w:numPr>
         <w:spacing w:before="0" w:after="80"/>
         <w:rPr/>
@@ -327,7 +323,7 @@
         <w:pStyle w:val="ListParagraph"/>
         <w:numPr>
           <w:ilvl w:val="0"/>
-          <w:numId w:val="1"/>
+          <w:numId w:val="2"/>
         </w:numPr>
         <w:spacing w:before="0" w:after="80"/>
         <w:rPr/>
@@ -342,7 +338,7 @@
         <w:pStyle w:val="ListParagraph"/>
         <w:numPr>
           <w:ilvl w:val="0"/>
-          <w:numId w:val="1"/>
+          <w:numId w:val="2"/>
         </w:numPr>
         <w:spacing w:before="0" w:after="80"/>
         <w:rPr/>
@@ -357,7 +353,7 @@
         <w:pStyle w:val="ListParagraph"/>
         <w:numPr>
           <w:ilvl w:val="0"/>
-          <w:numId w:val="1"/>
+          <w:numId w:val="2"/>
         </w:numPr>
         <w:spacing w:before="0" w:after="80"/>
         <w:rPr/>
@@ -372,7 +368,7 @@
         <w:pStyle w:val="ListParagraph"/>
         <w:numPr>
           <w:ilvl w:val="0"/>
-          <w:numId w:val="1"/>
+          <w:numId w:val="2"/>
         </w:numPr>
         <w:spacing w:before="0" w:after="80"/>
         <w:rPr/>
@@ -387,7 +383,7 @@
         <w:pStyle w:val="ListParagraph"/>
         <w:numPr>
           <w:ilvl w:val="0"/>
-          <w:numId w:val="1"/>
+          <w:numId w:val="2"/>
         </w:numPr>
         <w:spacing w:before="0" w:after="80"/>
         <w:rPr/>
@@ -402,7 +398,7 @@
         <w:pStyle w:val="ListParagraph"/>
         <w:numPr>
           <w:ilvl w:val="0"/>
-          <w:numId w:val="1"/>
+          <w:numId w:val="2"/>
         </w:numPr>
         <w:spacing w:before="0" w:after="80"/>
         <w:rPr/>
@@ -417,7 +413,7 @@
         <w:pStyle w:val="ListParagraph"/>
         <w:numPr>
           <w:ilvl w:val="0"/>
-          <w:numId w:val="1"/>
+          <w:numId w:val="2"/>
         </w:numPr>
         <w:spacing w:before="0" w:after="80"/>
         <w:rPr/>
@@ -432,7 +428,7 @@
         <w:pStyle w:val="ListParagraph"/>
         <w:numPr>
           <w:ilvl w:val="0"/>
-          <w:numId w:val="1"/>
+          <w:numId w:val="2"/>
         </w:numPr>
         <w:spacing w:before="0" w:after="80"/>
         <w:rPr/>
@@ -499,7 +495,7 @@
         <w:pStyle w:val="ListParagraph"/>
         <w:numPr>
           <w:ilvl w:val="0"/>
-          <w:numId w:val="1"/>
+          <w:numId w:val="2"/>
         </w:numPr>
         <w:spacing w:before="0" w:after="80"/>
         <w:rPr/>
@@ -514,7 +510,7 @@
         <w:pStyle w:val="ListParagraph"/>
         <w:numPr>
           <w:ilvl w:val="0"/>
-          <w:numId w:val="1"/>
+          <w:numId w:val="2"/>
         </w:numPr>
         <w:spacing w:before="0" w:after="80"/>
         <w:rPr/>
@@ -529,7 +525,7 @@
         <w:pStyle w:val="ListParagraph"/>
         <w:numPr>
           <w:ilvl w:val="0"/>
-          <w:numId w:val="1"/>
+          <w:numId w:val="2"/>
         </w:numPr>
         <w:spacing w:before="0" w:after="80"/>
         <w:rPr/>
@@ -545,6 +541,7 @@
     <w:p>
       <w:pPr>
         <w:pStyle w:val="Normal"/>
+        <w:spacing w:before="0" w:after="0"/>
         <w:rPr/>
       </w:pPr>
       <w:r>
@@ -1510,10 +1507,597 @@
         <w:rPr/>
       </w:pPr>
       <w:r>
+        <w:rPr/>
+      </w:r>
+      <w:r>
         <w:br w:type="page"/>
       </w:r>
-      <w:r>
-        <w:rPr/>
+    </w:p>
+    <w:p>
+      <w:pPr>
+        <w:pStyle w:val="Heading1"/>
+        <w:spacing w:before="0" w:after="200"/>
+        <w:rPr/>
+      </w:pPr>
+      <w:r>
+        <w:rPr/>
+        <w:t>III. Acteurs (Bénéficiaires et utilisateurs)</w:t>
+      </w:r>
+    </w:p>
+    <w:p>
+      <w:pPr>
+        <w:pStyle w:val="Heading2"/>
+        <w:spacing w:before="300" w:after="150"/>
+        <w:rPr/>
+      </w:pPr>
+      <w:r>
+        <w:rPr/>
+        <w:t>3.1 Bénéficiaires du projet</w:t>
+      </w:r>
+    </w:p>
+    <w:p>
+      <w:pPr>
+        <w:pStyle w:val="ListParagraph"/>
+        <w:numPr>
+          <w:ilvl w:val="0"/>
+          <w:numId w:val="2"/>
+        </w:numPr>
+        <w:spacing w:before="0" w:after="80"/>
+        <w:rPr/>
+      </w:pPr>
+      <w:r>
+        <w:rPr/>
+        <w:t>Les groupes de tontine et associations communautaires cherchant à professionnaliser leur gestion.</w:t>
+      </w:r>
+    </w:p>
+    <w:p>
+      <w:pPr>
+        <w:pStyle w:val="ListParagraph"/>
+        <w:numPr>
+          <w:ilvl w:val="0"/>
+          <w:numId w:val="2"/>
+        </w:numPr>
+        <w:spacing w:before="0" w:after="80"/>
+        <w:rPr/>
+      </w:pPr>
+      <w:r>
+        <w:rPr/>
+        <w:t>Les membres cotisants gagnant en transparence et en confiance dans les opérations du groupe.</w:t>
+      </w:r>
+    </w:p>
+    <w:p>
+      <w:pPr>
+        <w:pStyle w:val="ListParagraph"/>
+        <w:numPr>
+          <w:ilvl w:val="0"/>
+          <w:numId w:val="2"/>
+        </w:numPr>
+        <w:spacing w:before="0" w:after="80"/>
+        <w:rPr/>
+      </w:pPr>
+      <w:r>
+        <w:rPr/>
+        <w:t>Les administrateurs disposant d'outils de pilotage et de reporting fiables.</w:t>
+      </w:r>
+    </w:p>
+    <w:p>
+      <w:pPr>
+        <w:pStyle w:val="ListParagraph"/>
+        <w:numPr>
+          <w:ilvl w:val="0"/>
+          <w:numId w:val="2"/>
+        </w:numPr>
+        <w:spacing w:before="0" w:after="80"/>
+        <w:rPr/>
+      </w:pPr>
+      <w:r>
+        <w:rPr/>
+        <w:t>Les emprunteurs membres accédant à un microcrédit interne encadré par le groupe.</w:t>
+      </w:r>
+    </w:p>
+    <w:p>
+      <w:pPr>
+        <w:pStyle w:val="ListParagraph"/>
+        <w:numPr>
+          <w:ilvl w:val="0"/>
+          <w:numId w:val="2"/>
+        </w:numPr>
+        <w:spacing w:before="0" w:after="80"/>
+        <w:rPr/>
+      </w:pPr>
+      <w:r>
+        <w:rPr/>
+        <w:t>La société camerounaise, via la pérennisation d'un mécanisme d'épargne solidaire mieux structuré.</w:t>
+      </w:r>
+    </w:p>
+    <w:p>
+      <w:pPr>
+        <w:pStyle w:val="Heading2"/>
+        <w:spacing w:before="300" w:after="150"/>
+        <w:rPr/>
+      </w:pPr>
+      <w:r>
+        <w:rPr/>
+        <w:t>3.2 Utilisateurs du système</w:t>
+      </w:r>
+    </w:p>
+    <w:p>
+      <w:pPr>
+        <w:pStyle w:val="Heading3"/>
+        <w:spacing w:before="200" w:after="100"/>
+        <w:rPr/>
+      </w:pPr>
+      <w:r>
+        <w:rPr/>
+        <w:t>Utilisateur non authentifié (Visiteur)</w:t>
+      </w:r>
+    </w:p>
+    <w:p>
+      <w:pPr>
+        <w:pStyle w:val="ListParagraph"/>
+        <w:numPr>
+          <w:ilvl w:val="0"/>
+          <w:numId w:val="2"/>
+        </w:numPr>
+        <w:spacing w:before="0" w:after="80"/>
+        <w:rPr/>
+      </w:pPr>
+      <w:r>
+        <w:rPr/>
+        <w:t>Consulte la page d'accueil publique.</w:t>
+      </w:r>
+    </w:p>
+    <w:p>
+      <w:pPr>
+        <w:pStyle w:val="ListParagraph"/>
+        <w:numPr>
+          <w:ilvl w:val="0"/>
+          <w:numId w:val="2"/>
+        </w:numPr>
+        <w:spacing w:before="0" w:after="80"/>
+        <w:rPr/>
+      </w:pPr>
+      <w:r>
+        <w:rPr/>
+        <w:t>Crée un compte utilisateur.</w:t>
+      </w:r>
+    </w:p>
+    <w:p>
+      <w:pPr>
+        <w:pStyle w:val="ListParagraph"/>
+        <w:numPr>
+          <w:ilvl w:val="0"/>
+          <w:numId w:val="2"/>
+        </w:numPr>
+        <w:spacing w:before="0" w:after="80"/>
+        <w:rPr/>
+      </w:pPr>
+      <w:r>
+        <w:rPr/>
+        <w:t>S’inscrire à l'application.</w:t>
+      </w:r>
+    </w:p>
+    <w:p>
+      <w:pPr>
+        <w:pStyle w:val="ListParagraph"/>
+        <w:numPr>
+          <w:ilvl w:val="0"/>
+          <w:numId w:val="2"/>
+        </w:numPr>
+        <w:spacing w:before="0" w:after="80"/>
+        <w:rPr/>
+      </w:pPr>
+      <w:r>
+        <w:rPr/>
+        <w:t>Ouvre un lien d'invitation pour rejoindre un groupe.</w:t>
+      </w:r>
+    </w:p>
+    <w:p>
+      <w:pPr>
+        <w:pStyle w:val="Heading3"/>
+        <w:spacing w:before="200" w:after="100"/>
+        <w:rPr/>
+      </w:pPr>
+      <w:r>
+        <w:rPr/>
+        <w:t>Membre de groupe</w:t>
+      </w:r>
+    </w:p>
+    <w:p>
+      <w:pPr>
+        <w:pStyle w:val="ListParagraph"/>
+        <w:numPr>
+          <w:ilvl w:val="0"/>
+          <w:numId w:val="2"/>
+        </w:numPr>
+        <w:spacing w:before="0" w:after="80"/>
+        <w:rPr/>
+      </w:pPr>
+      <w:r>
+        <w:rPr/>
+        <w:t>Consulte ses groupes et le tableau de bord personnel.</w:t>
+      </w:r>
+    </w:p>
+    <w:p>
+      <w:pPr>
+        <w:pStyle w:val="ListParagraph"/>
+        <w:numPr>
+          <w:ilvl w:val="0"/>
+          <w:numId w:val="2"/>
+        </w:numPr>
+        <w:spacing w:before="0" w:after="80"/>
+        <w:rPr/>
+      </w:pPr>
+      <w:r>
+        <w:rPr/>
+        <w:t>Consulte les cycles auxquels il participe, son ordre de passage, ses cotisations et pénalités.</w:t>
+      </w:r>
+    </w:p>
+    <w:p>
+      <w:pPr>
+        <w:pStyle w:val="ListParagraph"/>
+        <w:numPr>
+          <w:ilvl w:val="0"/>
+          <w:numId w:val="2"/>
+        </w:numPr>
+        <w:spacing w:before="0" w:after="80"/>
+        <w:rPr/>
+      </w:pPr>
+      <w:r>
+        <w:rPr/>
+        <w:t>Consulte les rubriques qui le concernent et les réunions planifiées.</w:t>
+      </w:r>
+    </w:p>
+    <w:p>
+      <w:pPr>
+        <w:pStyle w:val="ListParagraph"/>
+        <w:numPr>
+          <w:ilvl w:val="0"/>
+          <w:numId w:val="2"/>
+        </w:numPr>
+        <w:spacing w:before="0" w:after="80"/>
+        <w:rPr/>
+      </w:pPr>
+      <w:r>
+        <w:rPr/>
+        <w:t>Signale une absence avant une réunion.</w:t>
+      </w:r>
+    </w:p>
+    <w:p>
+      <w:pPr>
+        <w:pStyle w:val="ListParagraph"/>
+        <w:numPr>
+          <w:ilvl w:val="0"/>
+          <w:numId w:val="2"/>
+        </w:numPr>
+        <w:spacing w:before="0" w:after="80"/>
+        <w:rPr/>
+      </w:pPr>
+      <w:r>
+        <w:rPr/>
+        <w:t>Consulte son compte d'épargne et peut signaler un mouvement suspect.</w:t>
+      </w:r>
+    </w:p>
+    <w:p>
+      <w:pPr>
+        <w:pStyle w:val="ListParagraph"/>
+        <w:numPr>
+          <w:ilvl w:val="0"/>
+          <w:numId w:val="2"/>
+        </w:numPr>
+        <w:spacing w:before="0" w:after="80"/>
+        <w:rPr/>
+      </w:pPr>
+      <w:r>
+        <w:rPr/>
+        <w:t>Soumet une demande de prêt, propose ou accepte d'être avaliste.</w:t>
+      </w:r>
+    </w:p>
+    <w:p>
+      <w:pPr>
+        <w:pStyle w:val="ListParagraph"/>
+        <w:numPr>
+          <w:ilvl w:val="0"/>
+          <w:numId w:val="2"/>
+        </w:numPr>
+        <w:spacing w:before="0" w:after="80"/>
+        <w:rPr/>
+      </w:pPr>
+      <w:r>
+        <w:rPr/>
+        <w:t>Demande un échange de tour avec un autre participant.</w:t>
+      </w:r>
+    </w:p>
+    <w:p>
+      <w:pPr>
+        <w:pStyle w:val="ListParagraph"/>
+        <w:numPr>
+          <w:ilvl w:val="0"/>
+          <w:numId w:val="2"/>
+        </w:numPr>
+        <w:spacing w:before="0" w:after="80"/>
+        <w:rPr/>
+      </w:pPr>
+      <w:r>
+        <w:rPr/>
+        <w:t>Télécharge son relevé PDF individuel.</w:t>
+      </w:r>
+    </w:p>
+    <w:p>
+      <w:pPr>
+        <w:pStyle w:val="ListParagraph"/>
+        <w:numPr>
+          <w:ilvl w:val="0"/>
+          <w:numId w:val="2"/>
+        </w:numPr>
+        <w:spacing w:before="0" w:after="80"/>
+        <w:rPr/>
+      </w:pPr>
+      <w:r>
+        <w:rPr/>
+        <w:t>Lit et gère ses notifications.</w:t>
+      </w:r>
+    </w:p>
+    <w:p>
+      <w:pPr>
+        <w:pStyle w:val="Heading3"/>
+        <w:spacing w:before="200" w:after="100"/>
+        <w:rPr/>
+      </w:pPr>
+      <w:r>
+        <w:rPr/>
+        <w:t>Administrateur de groupe</w:t>
+      </w:r>
+    </w:p>
+    <w:p>
+      <w:pPr>
+        <w:pStyle w:val="ListParagraph"/>
+        <w:numPr>
+          <w:ilvl w:val="0"/>
+          <w:numId w:val="2"/>
+        </w:numPr>
+        <w:spacing w:before="0" w:after="80"/>
+        <w:rPr/>
+      </w:pPr>
+      <w:r>
+        <w:rPr/>
+        <w:t>Crée, modifie et supprime un groupe.</w:t>
+      </w:r>
+    </w:p>
+    <w:p>
+      <w:pPr>
+        <w:pStyle w:val="ListParagraph"/>
+        <w:numPr>
+          <w:ilvl w:val="0"/>
+          <w:numId w:val="2"/>
+        </w:numPr>
+        <w:spacing w:before="0" w:after="80"/>
+        <w:rPr/>
+      </w:pPr>
+      <w:r>
+        <w:rPr/>
+        <w:t>Génère, consulte, révoque et partage les invitations.</w:t>
+      </w:r>
+    </w:p>
+    <w:p>
+      <w:pPr>
+        <w:pStyle w:val="ListParagraph"/>
+        <w:numPr>
+          <w:ilvl w:val="0"/>
+          <w:numId w:val="2"/>
+        </w:numPr>
+        <w:spacing w:before="0" w:after="80"/>
+        <w:rPr/>
+      </w:pPr>
+      <w:r>
+        <w:rPr/>
+        <w:t>Gère les membres, les rôles, les exclusions et les réintégrations.</w:t>
+      </w:r>
+    </w:p>
+    <w:p>
+      <w:pPr>
+        <w:pStyle w:val="ListParagraph"/>
+        <w:numPr>
+          <w:ilvl w:val="0"/>
+          <w:numId w:val="2"/>
+        </w:numPr>
+        <w:spacing w:before="0" w:after="80"/>
+        <w:rPr/>
+      </w:pPr>
+      <w:r>
+        <w:rPr/>
+        <w:t>Crée, modifie, relance et clôture les cycles de tontine.</w:t>
+      </w:r>
+    </w:p>
+    <w:p>
+      <w:pPr>
+        <w:pStyle w:val="ListParagraph"/>
+        <w:numPr>
+          <w:ilvl w:val="0"/>
+          <w:numId w:val="2"/>
+        </w:numPr>
+        <w:spacing w:before="0" w:after="80"/>
+        <w:rPr/>
+      </w:pPr>
+      <w:r>
+        <w:rPr/>
+        <w:t>Définit l'ordre de passage et valide les échanges de tour.</w:t>
+      </w:r>
+    </w:p>
+    <w:p>
+      <w:pPr>
+        <w:pStyle w:val="ListParagraph"/>
+        <w:numPr>
+          <w:ilvl w:val="0"/>
+          <w:numId w:val="2"/>
+        </w:numPr>
+        <w:spacing w:before="0" w:after="80"/>
+        <w:rPr/>
+      </w:pPr>
+      <w:r>
+        <w:rPr/>
+        <w:t>Enregistre les cotisations, pénalités et versements du pot.</w:t>
+      </w:r>
+    </w:p>
+    <w:p>
+      <w:pPr>
+        <w:pStyle w:val="ListParagraph"/>
+        <w:numPr>
+          <w:ilvl w:val="0"/>
+          <w:numId w:val="2"/>
+        </w:numPr>
+        <w:spacing w:before="0" w:after="80"/>
+        <w:rPr/>
+      </w:pPr>
+      <w:r>
+        <w:rPr/>
+        <w:t>Gère les rubriques, paiements et retraits associés.</w:t>
+      </w:r>
+    </w:p>
+    <w:p>
+      <w:pPr>
+        <w:pStyle w:val="ListParagraph"/>
+        <w:numPr>
+          <w:ilvl w:val="0"/>
+          <w:numId w:val="2"/>
+        </w:numPr>
+        <w:spacing w:before="0" w:after="80"/>
+        <w:rPr/>
+      </w:pPr>
+      <w:r>
+        <w:rPr/>
+        <w:t>Planifie les réunions, enregistre les présences et encaisse les amendes.</w:t>
+      </w:r>
+    </w:p>
+    <w:p>
+      <w:pPr>
+        <w:pStyle w:val="ListParagraph"/>
+        <w:numPr>
+          <w:ilvl w:val="0"/>
+          <w:numId w:val="2"/>
+        </w:numPr>
+        <w:spacing w:before="0" w:after="80"/>
+        <w:rPr/>
+      </w:pPr>
+      <w:r>
+        <w:rPr/>
+        <w:t>Ouvre et administre les comptes d'épargne (dépôts, retraits, clôture).</w:t>
+      </w:r>
+    </w:p>
+    <w:p>
+      <w:pPr>
+        <w:pStyle w:val="ListParagraph"/>
+        <w:numPr>
+          <w:ilvl w:val="0"/>
+          <w:numId w:val="2"/>
+        </w:numPr>
+        <w:spacing w:before="0" w:after="80"/>
+        <w:rPr/>
+      </w:pPr>
+      <w:r>
+        <w:rPr/>
+        <w:t>Analyse, approuve, refuse, décaisse et suit les prêts internes.</w:t>
+      </w:r>
+    </w:p>
+    <w:p>
+      <w:pPr>
+        <w:pStyle w:val="ListParagraph"/>
+        <w:numPr>
+          <w:ilvl w:val="0"/>
+          <w:numId w:val="2"/>
+        </w:numPr>
+        <w:spacing w:before="0" w:after="80"/>
+        <w:rPr/>
+      </w:pPr>
+      <w:r>
+        <w:rPr/>
+        <w:t>Configure les paramètres de prêt du groupe.</w:t>
+      </w:r>
+    </w:p>
+    <w:p>
+      <w:pPr>
+        <w:pStyle w:val="ListParagraph"/>
+        <w:numPr>
+          <w:ilvl w:val="0"/>
+          <w:numId w:val="2"/>
+        </w:numPr>
+        <w:spacing w:before="0" w:after="80"/>
+        <w:rPr/>
+      </w:pPr>
+      <w:r>
+        <w:rPr/>
+        <w:t>Consulte le journal financier et exporte les rapports PDF/Excel.</w:t>
+      </w:r>
+    </w:p>
+    <w:p>
+      <w:pPr>
+        <w:pStyle w:val="Heading3"/>
+        <w:spacing w:before="200" w:after="100"/>
+        <w:rPr/>
+      </w:pPr>
+      <w:r>
+        <w:rPr/>
+        <w:t>Système (acteur technique)</w:t>
+      </w:r>
+    </w:p>
+    <w:p>
+      <w:pPr>
+        <w:pStyle w:val="ListParagraph"/>
+        <w:numPr>
+          <w:ilvl w:val="0"/>
+          <w:numId w:val="2"/>
+        </w:numPr>
+        <w:spacing w:before="0" w:after="80"/>
+        <w:rPr/>
+      </w:pPr>
+      <w:r>
+        <w:rPr/>
+        <w:t>Calcule automatiquement les statuts visuels des membres.</w:t>
+      </w:r>
+    </w:p>
+    <w:p>
+      <w:pPr>
+        <w:pStyle w:val="ListParagraph"/>
+        <w:numPr>
+          <w:ilvl w:val="0"/>
+          <w:numId w:val="2"/>
+        </w:numPr>
+        <w:spacing w:before="0" w:after="80"/>
+        <w:rPr/>
+      </w:pPr>
+      <w:r>
+        <w:rPr/>
+        <w:t>Envoie les notifications lors des événements métier.</w:t>
+      </w:r>
+    </w:p>
+    <w:p>
+      <w:pPr>
+        <w:pStyle w:val="ListParagraph"/>
+        <w:numPr>
+          <w:ilvl w:val="0"/>
+          <w:numId w:val="2"/>
+        </w:numPr>
+        <w:spacing w:before="0" w:after="80"/>
+        <w:rPr/>
+      </w:pPr>
+      <w:r>
+        <w:rPr/>
+        <w:t>Applique les règles d'éligibilité aux prêts.</w:t>
+      </w:r>
+    </w:p>
+    <w:p>
+      <w:pPr>
+        <w:pStyle w:val="ListParagraph"/>
+        <w:numPr>
+          <w:ilvl w:val="0"/>
+          <w:numId w:val="2"/>
+        </w:numPr>
+        <w:spacing w:before="0" w:after="80"/>
+        <w:rPr/>
+      </w:pPr>
+      <w:r>
+        <w:rPr/>
+        <w:t>Journalise les mouvements financiers dans les caisses dédiées.IV. Besoins Fonctionnels</w:t>
       </w:r>
     </w:p>
     <w:p>
@@ -1524,7 +2108,11 @@
       </w:pPr>
       <w:r>
         <w:rPr/>
-        <w:t>III. Acteurs (Bénéficiaires et utilisateurs)</w:t>
+        <w:t>iv</w:t>
+      </w:r>
+      <w:r>
+        <w:rPr/>
+        <w:t>. Besoins Non-Fonctionnels et Exigences</w:t>
       </w:r>
     </w:p>
     <w:p>
@@ -1535,82 +2123,121 @@
       </w:pPr>
       <w:r>
         <w:rPr/>
-        <w:t>3.1 Bénéficiaires du projet</w:t>
-      </w:r>
-    </w:p>
-    <w:p>
-      <w:pPr>
-        <w:pStyle w:val="ListParagraph"/>
-        <w:numPr>
-          <w:ilvl w:val="0"/>
-          <w:numId w:val="1"/>
-        </w:numPr>
-        <w:spacing w:before="0" w:after="80"/>
-        <w:rPr/>
-      </w:pPr>
-      <w:r>
-        <w:rPr/>
-        <w:t>Les groupes de tontine et associations communautaires cherchant à professionnaliser leur gestion.</w:t>
-      </w:r>
-    </w:p>
-    <w:p>
-      <w:pPr>
-        <w:pStyle w:val="ListParagraph"/>
-        <w:numPr>
-          <w:ilvl w:val="0"/>
-          <w:numId w:val="1"/>
-        </w:numPr>
-        <w:spacing w:before="0" w:after="80"/>
-        <w:rPr/>
-      </w:pPr>
-      <w:r>
-        <w:rPr/>
-        <w:t>Les membres cotisants gagnant en transparence et en confiance dans les opérations du groupe.</w:t>
-      </w:r>
-    </w:p>
-    <w:p>
-      <w:pPr>
-        <w:pStyle w:val="ListParagraph"/>
-        <w:numPr>
-          <w:ilvl w:val="0"/>
-          <w:numId w:val="1"/>
-        </w:numPr>
-        <w:spacing w:before="0" w:after="80"/>
-        <w:rPr/>
-      </w:pPr>
-      <w:r>
-        <w:rPr/>
-        <w:t>Les administrateurs disposant d'outils de pilotage et de reporting fiables.</w:t>
-      </w:r>
-    </w:p>
-    <w:p>
-      <w:pPr>
-        <w:pStyle w:val="ListParagraph"/>
-        <w:numPr>
-          <w:ilvl w:val="0"/>
-          <w:numId w:val="1"/>
-        </w:numPr>
-        <w:spacing w:before="0" w:after="80"/>
-        <w:rPr/>
-      </w:pPr>
-      <w:r>
-        <w:rPr/>
-        <w:t>Les emprunteurs membres accédant à un microcrédit interne encadré par le groupe.</w:t>
-      </w:r>
-    </w:p>
-    <w:p>
-      <w:pPr>
-        <w:pStyle w:val="ListParagraph"/>
-        <w:numPr>
-          <w:ilvl w:val="0"/>
-          <w:numId w:val="1"/>
-        </w:numPr>
-        <w:spacing w:before="0" w:after="80"/>
-        <w:rPr/>
-      </w:pPr>
-      <w:r>
-        <w:rPr/>
-        <w:t>La société camerounaise, via la pérennisation d'un mécanisme d'épargne solidaire mieux structuré.</w:t>
+        <w:t>4.1 Module Authentification et profil</w:t>
+      </w:r>
+    </w:p>
+    <w:p>
+      <w:pPr>
+        <w:pStyle w:val="ListParagraph"/>
+        <w:numPr>
+          <w:ilvl w:val="0"/>
+          <w:numId w:val="2"/>
+        </w:numPr>
+        <w:spacing w:before="0" w:after="80"/>
+        <w:rPr/>
+      </w:pPr>
+      <w:r>
+        <w:rPr/>
+        <w:t xml:space="preserve"> </w:t>
+      </w:r>
+      <w:r>
+        <w:rPr/>
+        <w:t>Création de compte avec nom, prénom, téléphone, email et mot de passe.</w:t>
+      </w:r>
+    </w:p>
+    <w:p>
+      <w:pPr>
+        <w:pStyle w:val="ListParagraph"/>
+        <w:numPr>
+          <w:ilvl w:val="0"/>
+          <w:numId w:val="2"/>
+        </w:numPr>
+        <w:spacing w:before="0" w:after="80"/>
+        <w:rPr/>
+      </w:pPr>
+      <w:r>
+        <w:rPr/>
+        <w:t xml:space="preserve"> </w:t>
+      </w:r>
+      <w:r>
+        <w:rPr/>
+        <w:t>Connexion par email et mot de passe via Supabase Auth.</w:t>
+      </w:r>
+    </w:p>
+    <w:p>
+      <w:pPr>
+        <w:pStyle w:val="ListParagraph"/>
+        <w:numPr>
+          <w:ilvl w:val="0"/>
+          <w:numId w:val="2"/>
+        </w:numPr>
+        <w:spacing w:before="0" w:after="80"/>
+        <w:rPr/>
+      </w:pPr>
+      <w:r>
+        <w:rPr/>
+        <w:t xml:space="preserve"> </w:t>
+      </w:r>
+      <w:r>
+        <w:rPr/>
+        <w:t>Gestion des sessions serveur (cookies SSR).</w:t>
+      </w:r>
+    </w:p>
+    <w:p>
+      <w:pPr>
+        <w:pStyle w:val="ListParagraph"/>
+        <w:numPr>
+          <w:ilvl w:val="0"/>
+          <w:numId w:val="2"/>
+        </w:numPr>
+        <w:spacing w:before="0" w:after="80"/>
+        <w:rPr/>
+      </w:pPr>
+      <w:r>
+        <w:rPr/>
+        <w:t xml:space="preserve"> </w:t>
+      </w:r>
+      <w:r>
+        <w:rPr/>
+        <w:t>Réinitialisation et mise à jour du mot de passe.</w:t>
+      </w:r>
+    </w:p>
+    <w:p>
+      <w:pPr>
+        <w:pStyle w:val="ListParagraph"/>
+        <w:numPr>
+          <w:ilvl w:val="0"/>
+          <w:numId w:val="2"/>
+        </w:numPr>
+        <w:spacing w:before="0" w:after="80"/>
+        <w:rPr/>
+      </w:pPr>
+      <w:r>
+        <w:rPr/>
+        <w:t xml:space="preserve"> </w:t>
+      </w:r>
+      <w:r>
+        <w:rPr/>
+        <w:t>Modification du profil (nom, prénom, téléphone, photo de profil).</w:t>
+      </w:r>
+    </w:p>
+    <w:p>
+      <w:pPr>
+        <w:pStyle w:val="ListParagraph"/>
+        <w:numPr>
+          <w:ilvl w:val="0"/>
+          <w:numId w:val="2"/>
+        </w:numPr>
+        <w:spacing w:before="0" w:after="80"/>
+        <w:rPr/>
+      </w:pPr>
+      <w:r>
+        <w:rPr/>
+        <w:t xml:space="preserve"> </w:t>
+      </w:r>
+      <w:r>
+        <w:rPr/>
+        <w:t>Déconnexion sécurisée.</w:t>
       </w:r>
     </w:p>
     <w:p>
@@ -1621,494 +2248,142 @@
       </w:pPr>
       <w:r>
         <w:rPr/>
-        <w:t>3.2 Utilisateurs du système</w:t>
-      </w:r>
-    </w:p>
-    <w:p>
-      <w:pPr>
-        <w:pStyle w:val="Heading3"/>
-        <w:spacing w:before="200" w:after="100"/>
-        <w:rPr/>
-      </w:pPr>
-      <w:r>
-        <w:rPr/>
-        <w:t>Utilisateur non authentifié (Visiteur)</w:t>
-      </w:r>
-    </w:p>
-    <w:p>
-      <w:pPr>
-        <w:pStyle w:val="ListParagraph"/>
-        <w:numPr>
-          <w:ilvl w:val="0"/>
-          <w:numId w:val="1"/>
-        </w:numPr>
-        <w:spacing w:before="0" w:after="80"/>
-        <w:rPr/>
-      </w:pPr>
-      <w:r>
-        <w:rPr/>
-        <w:t>Consulte la page d'accueil publique.</w:t>
-      </w:r>
-    </w:p>
-    <w:p>
-      <w:pPr>
-        <w:pStyle w:val="ListParagraph"/>
-        <w:numPr>
-          <w:ilvl w:val="0"/>
-          <w:numId w:val="1"/>
-        </w:numPr>
-        <w:spacing w:before="0" w:after="80"/>
-        <w:rPr/>
-      </w:pPr>
-      <w:r>
-        <w:rPr/>
-        <w:t>Crée un compte utilisateur.</w:t>
-      </w:r>
-    </w:p>
-    <w:p>
-      <w:pPr>
-        <w:pStyle w:val="ListParagraph"/>
-        <w:numPr>
-          <w:ilvl w:val="0"/>
-          <w:numId w:val="1"/>
-        </w:numPr>
-        <w:spacing w:before="0" w:after="80"/>
-        <w:rPr/>
-      </w:pPr>
-      <w:r>
-        <w:rPr/>
-        <w:t>S’</w:t>
-      </w:r>
-      <w:r>
-        <w:rPr/>
-        <w:t xml:space="preserve">inscrire </w:t>
-      </w:r>
-      <w:r>
-        <w:rPr/>
-        <w:t>à l'application.</w:t>
-      </w:r>
-    </w:p>
-    <w:p>
-      <w:pPr>
-        <w:pStyle w:val="ListParagraph"/>
-        <w:numPr>
-          <w:ilvl w:val="0"/>
-          <w:numId w:val="1"/>
-        </w:numPr>
-        <w:spacing w:before="0" w:after="80"/>
-        <w:rPr/>
-      </w:pPr>
-      <w:r>
-        <w:rPr/>
-        <w:t>Ouvre un lien d'invitation pour rejoindre un groupe.</w:t>
-      </w:r>
-    </w:p>
-    <w:p>
-      <w:pPr>
-        <w:pStyle w:val="Heading3"/>
-        <w:spacing w:before="200" w:after="100"/>
-        <w:rPr/>
-      </w:pPr>
-      <w:r>
-        <w:rPr/>
-        <w:t>Membre de groupe</w:t>
-      </w:r>
-    </w:p>
-    <w:p>
-      <w:pPr>
-        <w:pStyle w:val="ListParagraph"/>
-        <w:numPr>
-          <w:ilvl w:val="0"/>
-          <w:numId w:val="1"/>
-        </w:numPr>
-        <w:spacing w:before="0" w:after="80"/>
-        <w:rPr/>
-      </w:pPr>
-      <w:r>
-        <w:rPr/>
-        <w:t>Consulte ses groupes et le tableau de bord personnel.</w:t>
-      </w:r>
-    </w:p>
-    <w:p>
-      <w:pPr>
-        <w:pStyle w:val="ListParagraph"/>
-        <w:numPr>
-          <w:ilvl w:val="0"/>
-          <w:numId w:val="1"/>
-        </w:numPr>
-        <w:spacing w:before="0" w:after="80"/>
-        <w:rPr/>
-      </w:pPr>
-      <w:r>
-        <w:rPr/>
-        <w:t>Consulte les cycles auxquels il participe, son ordre de passage, ses cotisations et pénalités.</w:t>
-      </w:r>
-    </w:p>
-    <w:p>
-      <w:pPr>
-        <w:pStyle w:val="ListParagraph"/>
-        <w:numPr>
-          <w:ilvl w:val="0"/>
-          <w:numId w:val="1"/>
-        </w:numPr>
-        <w:spacing w:before="0" w:after="80"/>
-        <w:rPr/>
-      </w:pPr>
-      <w:r>
-        <w:rPr/>
-        <w:t>Consulte les rubriques qui le concernent et les réunions planifiées.</w:t>
-      </w:r>
-    </w:p>
-    <w:p>
-      <w:pPr>
-        <w:pStyle w:val="ListParagraph"/>
-        <w:numPr>
-          <w:ilvl w:val="0"/>
-          <w:numId w:val="1"/>
-        </w:numPr>
-        <w:spacing w:before="0" w:after="80"/>
-        <w:rPr/>
-      </w:pPr>
-      <w:r>
-        <w:rPr/>
-        <w:t>Signale une absence avant une réunion.</w:t>
-      </w:r>
-    </w:p>
-    <w:p>
-      <w:pPr>
-        <w:pStyle w:val="ListParagraph"/>
-        <w:numPr>
-          <w:ilvl w:val="0"/>
-          <w:numId w:val="1"/>
-        </w:numPr>
-        <w:spacing w:before="0" w:after="80"/>
-        <w:rPr/>
-      </w:pPr>
-      <w:r>
-        <w:rPr/>
-        <w:t>Consulte son compte d'épargne et peut signaler un mouvement suspect.</w:t>
-      </w:r>
-    </w:p>
-    <w:p>
-      <w:pPr>
-        <w:pStyle w:val="ListParagraph"/>
-        <w:numPr>
-          <w:ilvl w:val="0"/>
-          <w:numId w:val="1"/>
-        </w:numPr>
-        <w:spacing w:before="0" w:after="80"/>
-        <w:rPr/>
-      </w:pPr>
-      <w:r>
-        <w:rPr/>
-        <w:t>Soumet une demande de prêt, propose ou accepte d'être avaliste.</w:t>
-      </w:r>
-    </w:p>
-    <w:p>
-      <w:pPr>
-        <w:pStyle w:val="ListParagraph"/>
-        <w:numPr>
-          <w:ilvl w:val="0"/>
-          <w:numId w:val="1"/>
-        </w:numPr>
-        <w:spacing w:before="0" w:after="80"/>
-        <w:rPr/>
-      </w:pPr>
-      <w:r>
-        <w:rPr/>
-        <w:t>Demande un échange de tour avec un autre participant.</w:t>
-      </w:r>
-    </w:p>
-    <w:p>
-      <w:pPr>
-        <w:pStyle w:val="ListParagraph"/>
-        <w:numPr>
-          <w:ilvl w:val="0"/>
-          <w:numId w:val="1"/>
-        </w:numPr>
-        <w:spacing w:before="0" w:after="80"/>
-        <w:rPr/>
-      </w:pPr>
-      <w:r>
-        <w:rPr/>
-        <w:t>Télécharge son relevé PDF individuel.</w:t>
-      </w:r>
-    </w:p>
-    <w:p>
-      <w:pPr>
-        <w:pStyle w:val="ListParagraph"/>
-        <w:numPr>
-          <w:ilvl w:val="0"/>
-          <w:numId w:val="1"/>
-        </w:numPr>
-        <w:spacing w:before="0" w:after="80"/>
-        <w:rPr/>
-      </w:pPr>
-      <w:r>
-        <w:rPr/>
-        <w:t>Lit et gère ses notifications.</w:t>
-      </w:r>
-    </w:p>
-    <w:p>
-      <w:pPr>
-        <w:pStyle w:val="Heading3"/>
-        <w:spacing w:before="200" w:after="100"/>
-        <w:rPr/>
-      </w:pPr>
-      <w:r>
-        <w:rPr/>
-        <w:t>Administrateur de groupe</w:t>
-      </w:r>
-    </w:p>
-    <w:p>
-      <w:pPr>
-        <w:pStyle w:val="ListParagraph"/>
-        <w:numPr>
-          <w:ilvl w:val="0"/>
-          <w:numId w:val="1"/>
-        </w:numPr>
-        <w:spacing w:before="0" w:after="80"/>
-        <w:rPr/>
-      </w:pPr>
-      <w:r>
-        <w:rPr/>
-        <w:t>Crée, modifie et supprime un groupe.</w:t>
-      </w:r>
-    </w:p>
-    <w:p>
-      <w:pPr>
-        <w:pStyle w:val="ListParagraph"/>
-        <w:numPr>
-          <w:ilvl w:val="0"/>
-          <w:numId w:val="1"/>
-        </w:numPr>
-        <w:spacing w:before="0" w:after="80"/>
-        <w:rPr/>
-      </w:pPr>
-      <w:r>
-        <w:rPr/>
-        <w:t>Génère, consulte, révoque et partage les invitations.</w:t>
-      </w:r>
-    </w:p>
-    <w:p>
-      <w:pPr>
-        <w:pStyle w:val="ListParagraph"/>
-        <w:numPr>
-          <w:ilvl w:val="0"/>
-          <w:numId w:val="1"/>
-        </w:numPr>
-        <w:spacing w:before="0" w:after="80"/>
-        <w:rPr/>
-      </w:pPr>
-      <w:r>
-        <w:rPr/>
-        <w:t>Gère les membres, les rôles, les exclusions et les réintégrations.</w:t>
-      </w:r>
-    </w:p>
-    <w:p>
-      <w:pPr>
-        <w:pStyle w:val="ListParagraph"/>
-        <w:numPr>
-          <w:ilvl w:val="0"/>
-          <w:numId w:val="1"/>
-        </w:numPr>
-        <w:spacing w:before="0" w:after="80"/>
-        <w:rPr/>
-      </w:pPr>
-      <w:r>
-        <w:rPr/>
-        <w:t>Crée, modifie, relance et clôture les cycles de tontine.</w:t>
-      </w:r>
-    </w:p>
-    <w:p>
-      <w:pPr>
-        <w:pStyle w:val="ListParagraph"/>
-        <w:numPr>
-          <w:ilvl w:val="0"/>
-          <w:numId w:val="1"/>
-        </w:numPr>
-        <w:spacing w:before="0" w:after="80"/>
-        <w:rPr/>
-      </w:pPr>
-      <w:r>
-        <w:rPr/>
-        <w:t>Définit l'ordre de passage et valide les échanges de tour.</w:t>
-      </w:r>
-    </w:p>
-    <w:p>
-      <w:pPr>
-        <w:pStyle w:val="ListParagraph"/>
-        <w:numPr>
-          <w:ilvl w:val="0"/>
-          <w:numId w:val="1"/>
-        </w:numPr>
-        <w:spacing w:before="0" w:after="80"/>
-        <w:rPr/>
-      </w:pPr>
-      <w:r>
-        <w:rPr/>
-        <w:t>Enregistre les cotisations, pénalités et versements du pot.</w:t>
-      </w:r>
-    </w:p>
-    <w:p>
-      <w:pPr>
-        <w:pStyle w:val="ListParagraph"/>
-        <w:numPr>
-          <w:ilvl w:val="0"/>
-          <w:numId w:val="1"/>
-        </w:numPr>
-        <w:spacing w:before="0" w:after="80"/>
-        <w:rPr/>
-      </w:pPr>
-      <w:r>
-        <w:rPr/>
-        <w:t>Gère les rubriques, paiements et retraits associés.</w:t>
-      </w:r>
-    </w:p>
-    <w:p>
-      <w:pPr>
-        <w:pStyle w:val="ListParagraph"/>
-        <w:numPr>
-          <w:ilvl w:val="0"/>
-          <w:numId w:val="1"/>
-        </w:numPr>
-        <w:spacing w:before="0" w:after="80"/>
-        <w:rPr/>
-      </w:pPr>
-      <w:r>
-        <w:rPr/>
-        <w:t>Planifie les réunions, enregistre les présences et encaisse les amendes.</w:t>
-      </w:r>
-    </w:p>
-    <w:p>
-      <w:pPr>
-        <w:pStyle w:val="ListParagraph"/>
-        <w:numPr>
-          <w:ilvl w:val="0"/>
-          <w:numId w:val="1"/>
-        </w:numPr>
-        <w:spacing w:before="0" w:after="80"/>
-        <w:rPr/>
-      </w:pPr>
-      <w:r>
-        <w:rPr/>
-        <w:t>Ouvre et administre les comptes d'épargne (dépôts, retraits, clôture).</w:t>
-      </w:r>
-    </w:p>
-    <w:p>
-      <w:pPr>
-        <w:pStyle w:val="ListParagraph"/>
-        <w:numPr>
-          <w:ilvl w:val="0"/>
-          <w:numId w:val="1"/>
-        </w:numPr>
-        <w:spacing w:before="0" w:after="80"/>
-        <w:rPr/>
-      </w:pPr>
-      <w:r>
-        <w:rPr/>
-        <w:t>Analyse, approuve, refuse, décaisse et suit les prêts internes.</w:t>
-      </w:r>
-    </w:p>
-    <w:p>
-      <w:pPr>
-        <w:pStyle w:val="ListParagraph"/>
-        <w:numPr>
-          <w:ilvl w:val="0"/>
-          <w:numId w:val="1"/>
-        </w:numPr>
-        <w:spacing w:before="0" w:after="80"/>
-        <w:rPr/>
-      </w:pPr>
-      <w:r>
-        <w:rPr/>
-        <w:t>Configure les paramètres de prêt du groupe.</w:t>
-      </w:r>
-    </w:p>
-    <w:p>
-      <w:pPr>
-        <w:pStyle w:val="ListParagraph"/>
-        <w:numPr>
-          <w:ilvl w:val="0"/>
-          <w:numId w:val="1"/>
-        </w:numPr>
-        <w:spacing w:before="0" w:after="80"/>
-        <w:rPr/>
-      </w:pPr>
-      <w:r>
-        <w:rPr/>
-        <w:t>Consulte le journal financier et exporte les rapports PDF/Excel.</w:t>
-      </w:r>
-    </w:p>
-    <w:p>
-      <w:pPr>
-        <w:pStyle w:val="Heading3"/>
-        <w:spacing w:before="200" w:after="100"/>
-        <w:rPr/>
-      </w:pPr>
-      <w:r>
-        <w:rPr/>
-        <w:t>Système (acteur technique)</w:t>
-      </w:r>
-    </w:p>
-    <w:p>
-      <w:pPr>
-        <w:pStyle w:val="ListParagraph"/>
-        <w:numPr>
-          <w:ilvl w:val="0"/>
-          <w:numId w:val="1"/>
-        </w:numPr>
-        <w:spacing w:before="0" w:after="80"/>
-        <w:rPr/>
-      </w:pPr>
-      <w:r>
-        <w:rPr/>
-        <w:t>Calcule automatiquement les statuts visuels des membres.</w:t>
-      </w:r>
-    </w:p>
-    <w:p>
-      <w:pPr>
-        <w:pStyle w:val="ListParagraph"/>
-        <w:numPr>
-          <w:ilvl w:val="0"/>
-          <w:numId w:val="1"/>
-        </w:numPr>
-        <w:spacing w:before="0" w:after="80"/>
-        <w:rPr/>
-      </w:pPr>
-      <w:r>
-        <w:rPr/>
-        <w:t>Envoie les notifications lors des événements métier.</w:t>
-      </w:r>
-    </w:p>
-    <w:p>
-      <w:pPr>
-        <w:pStyle w:val="ListParagraph"/>
-        <w:numPr>
-          <w:ilvl w:val="0"/>
-          <w:numId w:val="1"/>
-        </w:numPr>
-        <w:spacing w:before="0" w:after="80"/>
-        <w:rPr/>
-      </w:pPr>
-      <w:r>
-        <w:rPr/>
-        <w:t>Applique les règles d'éligibilité aux prêts.</w:t>
-      </w:r>
-    </w:p>
-    <w:p>
-      <w:pPr>
-        <w:pStyle w:val="ListParagraph"/>
-        <w:numPr>
-          <w:ilvl w:val="0"/>
-          <w:numId w:val="1"/>
-        </w:numPr>
-        <w:spacing w:before="0" w:after="80"/>
-        <w:rPr/>
-      </w:pPr>
-      <w:r>
-        <w:rPr/>
-        <w:t>Journalise les mouvements financiers dans les caisses dédiées.IV. Besoins Fonctionnels</w:t>
+        <w:t>4.2 Module Groupes, membres et invitations</w:t>
+      </w:r>
+    </w:p>
+    <w:p>
+      <w:pPr>
+        <w:pStyle w:val="ListParagraph"/>
+        <w:numPr>
+          <w:ilvl w:val="0"/>
+          <w:numId w:val="2"/>
+        </w:numPr>
+        <w:spacing w:before="0" w:after="80"/>
+        <w:rPr/>
+      </w:pPr>
+      <w:r>
+        <w:rPr/>
+        <w:t>Création d'un groupe avec nom, description et devise (défaut : XAF/FCFA).</w:t>
+      </w:r>
+    </w:p>
+    <w:p>
+      <w:pPr>
+        <w:pStyle w:val="ListParagraph"/>
+        <w:numPr>
+          <w:ilvl w:val="0"/>
+          <w:numId w:val="2"/>
+        </w:numPr>
+        <w:spacing w:before="0" w:after="80"/>
+        <w:rPr/>
+      </w:pPr>
+      <w:r>
+        <w:rPr/>
+        <w:t>Attribution automatique du rôle ADMIN au créateur.</w:t>
+      </w:r>
+    </w:p>
+    <w:p>
+      <w:pPr>
+        <w:pStyle w:val="ListParagraph"/>
+        <w:numPr>
+          <w:ilvl w:val="0"/>
+          <w:numId w:val="2"/>
+        </w:numPr>
+        <w:spacing w:before="0" w:after="80"/>
+        <w:rPr/>
+      </w:pPr>
+      <w:r>
+        <w:rPr/>
+        <w:t>Génération d'un code/lien d'invitation unique.</w:t>
+      </w:r>
+    </w:p>
+    <w:p>
+      <w:pPr>
+        <w:pStyle w:val="ListParagraph"/>
+        <w:numPr>
+          <w:ilvl w:val="0"/>
+          <w:numId w:val="2"/>
+        </w:numPr>
+        <w:spacing w:before="0" w:after="80"/>
+        <w:rPr/>
+      </w:pPr>
+      <w:r>
+        <w:rPr/>
+        <w:t>Adhésion par lien d'invitation (nouveau ou membre existant).</w:t>
+      </w:r>
+    </w:p>
+    <w:p>
+      <w:pPr>
+        <w:pStyle w:val="ListParagraph"/>
+        <w:numPr>
+          <w:ilvl w:val="0"/>
+          <w:numId w:val="2"/>
+        </w:numPr>
+        <w:spacing w:before="0" w:after="80"/>
+        <w:rPr/>
+      </w:pPr>
+      <w:r>
+        <w:rPr/>
+        <w:t>Liste des membres avec rôle, statut d'adhésion et statut visuel.</w:t>
+      </w:r>
+    </w:p>
+    <w:p>
+      <w:pPr>
+        <w:pStyle w:val="ListParagraph"/>
+        <w:numPr>
+          <w:ilvl w:val="0"/>
+          <w:numId w:val="2"/>
+        </w:numPr>
+        <w:spacing w:before="0" w:after="80"/>
+        <w:rPr/>
+      </w:pPr>
+      <w:r>
+        <w:rPr/>
+        <w:t>Changement de rôle par un administrateur (protection du dernier admin).</w:t>
+      </w:r>
+    </w:p>
+    <w:p>
+      <w:pPr>
+        <w:pStyle w:val="ListParagraph"/>
+        <w:numPr>
+          <w:ilvl w:val="0"/>
+          <w:numId w:val="2"/>
+        </w:numPr>
+        <w:spacing w:before="0" w:after="80"/>
+        <w:rPr/>
+      </w:pPr>
+      <w:r>
+        <w:rPr/>
+        <w:t>Exclusion d'un membre (statut INACTIF + date de départ).</w:t>
+      </w:r>
+    </w:p>
+    <w:p>
+      <w:pPr>
+        <w:pStyle w:val="ListParagraph"/>
+        <w:numPr>
+          <w:ilvl w:val="0"/>
+          <w:numId w:val="2"/>
+        </w:numPr>
+        <w:spacing w:before="0" w:after="80"/>
+        <w:rPr/>
+      </w:pPr>
+      <w:r>
+        <w:rPr/>
+        <w:t>Demande et validation de réintégration (statut EN_ATTENTE).</w:t>
+      </w:r>
+    </w:p>
+    <w:p>
+      <w:pPr>
+        <w:pStyle w:val="ListParagraph"/>
+        <w:numPr>
+          <w:ilvl w:val="0"/>
+          <w:numId w:val="2"/>
+        </w:numPr>
+        <w:spacing w:before="0" w:after="80"/>
+        <w:rPr/>
+      </w:pPr>
+      <w:r>
+        <w:rPr/>
+        <w:t>Modification et suppression d'un groupe par l'administrateur.</w:t>
       </w:r>
     </w:p>
     <w:p>
@@ -2119,15 +2394,90 @@
       </w:pPr>
       <w:r>
         <w:rPr/>
-        <w:t>4.1 Module Authentification et profil</w:t>
-      </w:r>
-    </w:p>
-    <w:p>
-      <w:pPr>
-        <w:pStyle w:val="ListParagraph"/>
-        <w:numPr>
-          <w:ilvl w:val="0"/>
-          <w:numId w:val="1"/>
+        <w:t>4.3 Module Cycles de tontine</w:t>
+      </w:r>
+    </w:p>
+    <w:p>
+      <w:pPr>
+        <w:pStyle w:val="ListParagraph"/>
+        <w:numPr>
+          <w:ilvl w:val="0"/>
+          <w:numId w:val="2"/>
+        </w:numPr>
+        <w:spacing w:before="0" w:after="80"/>
+        <w:rPr/>
+      </w:pPr>
+      <w:r>
+        <w:rPr/>
+        <w:t>Création d'un cycle (nom, dates, durée de tour, montant, participants).</w:t>
+      </w:r>
+    </w:p>
+    <w:p>
+      <w:pPr>
+        <w:pStyle w:val="ListParagraph"/>
+        <w:numPr>
+          <w:ilvl w:val="0"/>
+          <w:numId w:val="2"/>
+        </w:numPr>
+        <w:spacing w:before="0" w:after="80"/>
+        <w:rPr/>
+      </w:pPr>
+      <w:r>
+        <w:rPr/>
+        <w:t>Définition manuelle ou par tirage au sort de l'ordre des bénéficiaires.</w:t>
+      </w:r>
+    </w:p>
+    <w:p>
+      <w:pPr>
+        <w:pStyle w:val="ListParagraph"/>
+        <w:numPr>
+          <w:ilvl w:val="0"/>
+          <w:numId w:val="2"/>
+        </w:numPr>
+        <w:spacing w:before="0" w:after="80"/>
+        <w:rPr/>
+      </w:pPr>
+      <w:r>
+        <w:rPr/>
+        <w:t>Consultation de l'ordre de passage par tous les membres actifs.</w:t>
+      </w:r>
+    </w:p>
+    <w:p>
+      <w:pPr>
+        <w:pStyle w:val="ListParagraph"/>
+        <w:numPr>
+          <w:ilvl w:val="0"/>
+          <w:numId w:val="2"/>
+        </w:numPr>
+        <w:spacing w:before="0" w:after="80"/>
+        <w:rPr/>
+      </w:pPr>
+      <w:r>
+        <w:rPr/>
+        <w:t>Modification de l'ordre par l'administrateur.</w:t>
+      </w:r>
+    </w:p>
+    <w:p>
+      <w:pPr>
+        <w:pStyle w:val="ListParagraph"/>
+        <w:numPr>
+          <w:ilvl w:val="0"/>
+          <w:numId w:val="2"/>
+        </w:numPr>
+        <w:spacing w:before="0" w:after="80"/>
+        <w:rPr/>
+      </w:pPr>
+      <w:r>
+        <w:rPr/>
+        <w:t>Demande d'échange de tour entre membres avec validation administrative.</w:t>
+      </w:r>
+    </w:p>
+    <w:p>
+      <w:pPr>
+        <w:pStyle w:val="ListParagraph"/>
+        <w:numPr>
+          <w:ilvl w:val="0"/>
+          <w:numId w:val="2"/>
         </w:numPr>
         <w:spacing w:before="0" w:after="80"/>
         <w:rPr/>
@@ -2138,102 +2488,97 @@
       </w:r>
       <w:r>
         <w:rPr/>
-        <w:t>Création de compte avec nom, prénom, téléphone, email et mot de passe.</w:t>
-      </w:r>
-    </w:p>
-    <w:p>
-      <w:pPr>
-        <w:pStyle w:val="ListParagraph"/>
-        <w:numPr>
-          <w:ilvl w:val="0"/>
-          <w:numId w:val="1"/>
-        </w:numPr>
-        <w:spacing w:before="0" w:after="80"/>
-        <w:rPr/>
-      </w:pPr>
-      <w:r>
-        <w:rPr/>
-        <w:t xml:space="preserve"> </w:t>
-      </w:r>
-      <w:r>
-        <w:rPr/>
-        <w:t>Connexion par email et mot de passe via Supabase Auth.</w:t>
-      </w:r>
-    </w:p>
-    <w:p>
-      <w:pPr>
-        <w:pStyle w:val="ListParagraph"/>
-        <w:numPr>
-          <w:ilvl w:val="0"/>
-          <w:numId w:val="1"/>
-        </w:numPr>
-        <w:spacing w:before="0" w:after="80"/>
-        <w:rPr/>
-      </w:pPr>
-      <w:r>
-        <w:rPr/>
-        <w:t xml:space="preserve"> </w:t>
-      </w:r>
-      <w:r>
-        <w:rPr/>
-        <w:t>Gestion des sessions serveur (cookies SSR).</w:t>
-      </w:r>
-    </w:p>
-    <w:p>
-      <w:pPr>
-        <w:pStyle w:val="ListParagraph"/>
-        <w:numPr>
-          <w:ilvl w:val="0"/>
-          <w:numId w:val="1"/>
-        </w:numPr>
-        <w:spacing w:before="0" w:after="80"/>
-        <w:rPr/>
-      </w:pPr>
-      <w:r>
-        <w:rPr/>
-        <w:t xml:space="preserve"> </w:t>
-      </w:r>
-      <w:r>
-        <w:rPr/>
-        <w:t>Réinitialisation et mise à jour du mot de passe.</w:t>
-      </w:r>
-    </w:p>
-    <w:p>
-      <w:pPr>
-        <w:pStyle w:val="ListParagraph"/>
-        <w:numPr>
-          <w:ilvl w:val="0"/>
-          <w:numId w:val="1"/>
-        </w:numPr>
-        <w:spacing w:before="0" w:after="80"/>
-        <w:rPr/>
-      </w:pPr>
-      <w:r>
-        <w:rPr/>
-        <w:t xml:space="preserve"> </w:t>
-      </w:r>
-      <w:r>
-        <w:rPr/>
-        <w:t>Modification du profil (nom, prénom, téléphone, photo de profil).</w:t>
-      </w:r>
-    </w:p>
-    <w:p>
-      <w:pPr>
-        <w:pStyle w:val="ListParagraph"/>
-        <w:numPr>
-          <w:ilvl w:val="0"/>
-          <w:numId w:val="1"/>
-        </w:numPr>
-        <w:spacing w:before="0" w:after="80"/>
-        <w:rPr/>
-      </w:pPr>
-      <w:r>
-        <w:rPr/>
-        <w:t xml:space="preserve"> </w:t>
-      </w:r>
-      <w:r>
-        <w:rPr/>
-        <w:t>Déconnexion sécurisée.</w:t>
+        <w:t>Enregistrement des cotisations par tour actif.</w:t>
+      </w:r>
+    </w:p>
+    <w:p>
+      <w:pPr>
+        <w:pStyle w:val="ListParagraph"/>
+        <w:numPr>
+          <w:ilvl w:val="0"/>
+          <w:numId w:val="2"/>
+        </w:numPr>
+        <w:spacing w:before="0" w:after="80"/>
+        <w:rPr/>
+      </w:pPr>
+      <w:r>
+        <w:rPr/>
+        <w:t>Calcul du reste à payer par membre et par tour.</w:t>
+      </w:r>
+    </w:p>
+    <w:p>
+      <w:pPr>
+        <w:pStyle w:val="ListParagraph"/>
+        <w:numPr>
+          <w:ilvl w:val="0"/>
+          <w:numId w:val="2"/>
+        </w:numPr>
+        <w:spacing w:before="0" w:after="80"/>
+        <w:rPr/>
+      </w:pPr>
+      <w:r>
+        <w:rPr/>
+        <w:t>Application automatique ou manuelle des pénalités de retard.</w:t>
+      </w:r>
+    </w:p>
+    <w:p>
+      <w:pPr>
+        <w:pStyle w:val="ListParagraph"/>
+        <w:numPr>
+          <w:ilvl w:val="0"/>
+          <w:numId w:val="2"/>
+        </w:numPr>
+        <w:spacing w:before="0" w:after="80"/>
+        <w:rPr/>
+      </w:pPr>
+      <w:r>
+        <w:rPr/>
+        <w:t>Collecte des pénalités et retrait depuis la caisse des pénalités.</w:t>
+      </w:r>
+    </w:p>
+    <w:p>
+      <w:pPr>
+        <w:pStyle w:val="ListParagraph"/>
+        <w:numPr>
+          <w:ilvl w:val="0"/>
+          <w:numId w:val="2"/>
+        </w:numPr>
+        <w:spacing w:before="0" w:after="80"/>
+        <w:rPr/>
+      </w:pPr>
+      <w:r>
+        <w:rPr/>
+        <w:t>Versement du pot au bénéficiaire du tour (modes : virement, espèces, Mobile Money, chèque).</w:t>
+      </w:r>
+    </w:p>
+    <w:p>
+      <w:pPr>
+        <w:pStyle w:val="ListParagraph"/>
+        <w:numPr>
+          <w:ilvl w:val="0"/>
+          <w:numId w:val="2"/>
+        </w:numPr>
+        <w:spacing w:before="0" w:after="80"/>
+        <w:rPr/>
+      </w:pPr>
+      <w:r>
+        <w:rPr/>
+        <w:t>Suivi de la trésorerie du cycle (collecte, pénalités, distributions, solde).</w:t>
+      </w:r>
+    </w:p>
+    <w:p>
+      <w:pPr>
+        <w:pStyle w:val="ListParagraph"/>
+        <w:numPr>
+          <w:ilvl w:val="0"/>
+          <w:numId w:val="2"/>
+        </w:numPr>
+        <w:spacing w:before="0" w:after="80"/>
+        <w:rPr/>
+      </w:pPr>
+      <w:r>
+        <w:rPr/>
+        <w:t>Relance ou clôture d'un cycle.</w:t>
       </w:r>
     </w:p>
     <w:p>
@@ -2244,142 +2589,67 @@
       </w:pPr>
       <w:r>
         <w:rPr/>
-        <w:t>4.2 Module Groupes, membres et invitations</w:t>
-      </w:r>
-    </w:p>
-    <w:p>
-      <w:pPr>
-        <w:pStyle w:val="ListParagraph"/>
-        <w:numPr>
-          <w:ilvl w:val="0"/>
-          <w:numId w:val="1"/>
-        </w:numPr>
-        <w:spacing w:before="0" w:after="80"/>
-        <w:rPr/>
-      </w:pPr>
-      <w:r>
-        <w:rPr/>
-        <w:t>Création d'un groupe avec nom, description et devise (défaut : XAF/FCFA).</w:t>
-      </w:r>
-    </w:p>
-    <w:p>
-      <w:pPr>
-        <w:pStyle w:val="ListParagraph"/>
-        <w:numPr>
-          <w:ilvl w:val="0"/>
-          <w:numId w:val="1"/>
-        </w:numPr>
-        <w:spacing w:before="0" w:after="80"/>
-        <w:rPr/>
-      </w:pPr>
-      <w:r>
-        <w:rPr/>
-        <w:t>Attribution automatique du rôle ADMIN au créateur.</w:t>
-      </w:r>
-    </w:p>
-    <w:p>
-      <w:pPr>
-        <w:pStyle w:val="ListParagraph"/>
-        <w:numPr>
-          <w:ilvl w:val="0"/>
-          <w:numId w:val="1"/>
-        </w:numPr>
-        <w:spacing w:before="0" w:after="80"/>
-        <w:rPr/>
-      </w:pPr>
-      <w:r>
-        <w:rPr/>
-        <w:t>Génération d'un code/lien d'invitation unique.</w:t>
-      </w:r>
-    </w:p>
-    <w:p>
-      <w:pPr>
-        <w:pStyle w:val="ListParagraph"/>
-        <w:numPr>
-          <w:ilvl w:val="0"/>
-          <w:numId w:val="1"/>
-        </w:numPr>
-        <w:spacing w:before="0" w:after="80"/>
-        <w:rPr/>
-      </w:pPr>
-      <w:r>
-        <w:rPr/>
-        <w:t>Adhésion par lien d'invitation (nouveau ou membre existant).</w:t>
-      </w:r>
-    </w:p>
-    <w:p>
-      <w:pPr>
-        <w:pStyle w:val="ListParagraph"/>
-        <w:numPr>
-          <w:ilvl w:val="0"/>
-          <w:numId w:val="1"/>
-        </w:numPr>
-        <w:spacing w:before="0" w:after="80"/>
-        <w:rPr/>
-      </w:pPr>
-      <w:r>
-        <w:rPr/>
-        <w:t>Liste des membres avec rôle, statut d'adhésion et statut visuel.</w:t>
-      </w:r>
-    </w:p>
-    <w:p>
-      <w:pPr>
-        <w:pStyle w:val="ListParagraph"/>
-        <w:numPr>
-          <w:ilvl w:val="0"/>
-          <w:numId w:val="1"/>
-        </w:numPr>
-        <w:spacing w:before="0" w:after="80"/>
-        <w:rPr/>
-      </w:pPr>
-      <w:r>
-        <w:rPr/>
-        <w:t>Changement de rôle par un administrateur (protection du dernier admin).</w:t>
-      </w:r>
-    </w:p>
-    <w:p>
-      <w:pPr>
-        <w:pStyle w:val="ListParagraph"/>
-        <w:numPr>
-          <w:ilvl w:val="0"/>
-          <w:numId w:val="1"/>
-        </w:numPr>
-        <w:spacing w:before="0" w:after="80"/>
-        <w:rPr/>
-      </w:pPr>
-      <w:r>
-        <w:rPr/>
-        <w:t>Exclusion d'un membre (statut INACTIF + date de départ).</w:t>
-      </w:r>
-    </w:p>
-    <w:p>
-      <w:pPr>
-        <w:pStyle w:val="ListParagraph"/>
-        <w:numPr>
-          <w:ilvl w:val="0"/>
-          <w:numId w:val="1"/>
-        </w:numPr>
-        <w:spacing w:before="0" w:after="80"/>
-        <w:rPr/>
-      </w:pPr>
-      <w:r>
-        <w:rPr/>
-        <w:t>Demande et validation de réintégration (statut EN_ATTENTE).</w:t>
-      </w:r>
-    </w:p>
-    <w:p>
-      <w:pPr>
-        <w:pStyle w:val="ListParagraph"/>
-        <w:numPr>
-          <w:ilvl w:val="0"/>
-          <w:numId w:val="1"/>
-        </w:numPr>
-        <w:spacing w:before="0" w:after="80"/>
-        <w:rPr/>
-      </w:pPr>
-      <w:r>
-        <w:rPr/>
-        <w:t>Modification et suppression d'un groupe par l'administrateur.</w:t>
+        <w:t>4.4 Module Rubriques de cotisation</w:t>
+      </w:r>
+    </w:p>
+    <w:p>
+      <w:pPr>
+        <w:pStyle w:val="ListParagraph"/>
+        <w:numPr>
+          <w:ilvl w:val="0"/>
+          <w:numId w:val="2"/>
+        </w:numPr>
+        <w:spacing w:before="0" w:after="80"/>
+        <w:rPr/>
+      </w:pPr>
+      <w:r>
+        <w:rPr/>
+        <w:t>Création de rubriques (montant fixe, fréquence, durée, membres concernés).</w:t>
+      </w:r>
+    </w:p>
+    <w:p>
+      <w:pPr>
+        <w:pStyle w:val="ListParagraph"/>
+        <w:numPr>
+          <w:ilvl w:val="0"/>
+          <w:numId w:val="2"/>
+        </w:numPr>
+        <w:spacing w:before="0" w:after="80"/>
+        <w:rPr/>
+      </w:pPr>
+      <w:r>
+        <w:rPr/>
+        <w:t>Paiement d'une rubrique par membre ou par l'administrateur.</w:t>
+      </w:r>
+    </w:p>
+    <w:p>
+      <w:pPr>
+        <w:pStyle w:val="ListParagraph"/>
+        <w:numPr>
+          <w:ilvl w:val="0"/>
+          <w:numId w:val="2"/>
+        </w:numPr>
+        <w:spacing w:before="0" w:after="80"/>
+        <w:rPr/>
+      </w:pPr>
+      <w:r>
+        <w:rPr/>
+        <w:t>Retrait depuis une rubrique avec validation administrative.</w:t>
+      </w:r>
+    </w:p>
+    <w:p>
+      <w:pPr>
+        <w:pStyle w:val="ListParagraph"/>
+        <w:numPr>
+          <w:ilvl w:val="0"/>
+          <w:numId w:val="2"/>
+        </w:numPr>
+        <w:spacing w:before="0" w:after="80"/>
+        <w:rPr/>
+      </w:pPr>
+      <w:r>
+        <w:rPr/>
+        <w:t>Relance d'une rubrique expirée et notifications d'échéance.</w:t>
       </w:r>
     </w:p>
     <w:p>
@@ -2390,191 +2660,97 @@
       </w:pPr>
       <w:r>
         <w:rPr/>
-        <w:t>4.3 Module Cycles de tontine</w:t>
-      </w:r>
-    </w:p>
-    <w:p>
-      <w:pPr>
-        <w:pStyle w:val="ListParagraph"/>
-        <w:numPr>
-          <w:ilvl w:val="0"/>
-          <w:numId w:val="1"/>
-        </w:numPr>
-        <w:spacing w:before="0" w:after="80"/>
-        <w:rPr/>
-      </w:pPr>
-      <w:r>
-        <w:rPr/>
-        <w:t>Création d'un cycle (nom, dates, durée de tour, montant, participants).</w:t>
-      </w:r>
-    </w:p>
-    <w:p>
-      <w:pPr>
-        <w:pStyle w:val="ListParagraph"/>
-        <w:numPr>
-          <w:ilvl w:val="0"/>
-          <w:numId w:val="1"/>
-        </w:numPr>
-        <w:spacing w:before="0" w:after="80"/>
-        <w:rPr/>
-      </w:pPr>
-      <w:r>
-        <w:rPr/>
-        <w:t>Définition manuelle ou par tirage au sort de l'ordre des bénéficiaires.</w:t>
-      </w:r>
-    </w:p>
-    <w:p>
-      <w:pPr>
-        <w:pStyle w:val="ListParagraph"/>
-        <w:numPr>
-          <w:ilvl w:val="0"/>
-          <w:numId w:val="1"/>
-        </w:numPr>
-        <w:spacing w:before="0" w:after="80"/>
-        <w:rPr/>
-      </w:pPr>
-      <w:r>
-        <w:rPr/>
-        <w:t>Consultation de l'ordre de passage par tous les membres actifs.</w:t>
-      </w:r>
-    </w:p>
-    <w:p>
-      <w:pPr>
-        <w:pStyle w:val="ListParagraph"/>
-        <w:numPr>
-          <w:ilvl w:val="0"/>
-          <w:numId w:val="1"/>
-        </w:numPr>
-        <w:spacing w:before="0" w:after="80"/>
-        <w:rPr/>
-      </w:pPr>
-      <w:r>
-        <w:rPr/>
-        <w:t>Modification de l'ordre par l'administrateur.</w:t>
-      </w:r>
-    </w:p>
-    <w:p>
-      <w:pPr>
-        <w:pStyle w:val="ListParagraph"/>
-        <w:numPr>
-          <w:ilvl w:val="0"/>
-          <w:numId w:val="1"/>
-        </w:numPr>
-        <w:spacing w:before="0" w:after="80"/>
-        <w:rPr/>
-      </w:pPr>
-      <w:r>
-        <w:rPr/>
-        <w:t>Demande d'échange de tour entre membres avec validation administrative.</w:t>
-      </w:r>
-    </w:p>
-    <w:p>
-      <w:pPr>
-        <w:pStyle w:val="ListParagraph"/>
-        <w:numPr>
-          <w:ilvl w:val="0"/>
-          <w:numId w:val="1"/>
-        </w:numPr>
-        <w:spacing w:before="0" w:after="80"/>
-        <w:rPr/>
-      </w:pPr>
-      <w:r>
-        <w:rPr/>
-        <w:t xml:space="preserve"> </w:t>
-      </w:r>
-      <w:r>
-        <w:rPr/>
-        <w:t>Enregistrement des cotisations par tour actif.</w:t>
-      </w:r>
-    </w:p>
-    <w:p>
-      <w:pPr>
-        <w:pStyle w:val="ListParagraph"/>
-        <w:numPr>
-          <w:ilvl w:val="0"/>
-          <w:numId w:val="1"/>
-        </w:numPr>
-        <w:spacing w:before="0" w:after="80"/>
-        <w:rPr/>
-      </w:pPr>
-      <w:r>
-        <w:rPr/>
-        <w:t>Calcul du reste à payer par membre et par tour.</w:t>
-      </w:r>
-    </w:p>
-    <w:p>
-      <w:pPr>
-        <w:pStyle w:val="ListParagraph"/>
-        <w:numPr>
-          <w:ilvl w:val="0"/>
-          <w:numId w:val="1"/>
-        </w:numPr>
-        <w:spacing w:before="0" w:after="80"/>
-        <w:rPr/>
-      </w:pPr>
-      <w:r>
-        <w:rPr/>
-        <w:t>Application automatique ou manuelle des pénalités de retard.</w:t>
-      </w:r>
-    </w:p>
-    <w:p>
-      <w:pPr>
-        <w:pStyle w:val="ListParagraph"/>
-        <w:numPr>
-          <w:ilvl w:val="0"/>
-          <w:numId w:val="1"/>
-        </w:numPr>
-        <w:spacing w:before="0" w:after="80"/>
-        <w:rPr/>
-      </w:pPr>
-      <w:r>
-        <w:rPr/>
-        <w:t>Collecte des pénalités et retrait depuis la caisse des pénalités.</w:t>
-      </w:r>
-    </w:p>
-    <w:p>
-      <w:pPr>
-        <w:pStyle w:val="ListParagraph"/>
-        <w:numPr>
-          <w:ilvl w:val="0"/>
-          <w:numId w:val="1"/>
-        </w:numPr>
-        <w:spacing w:before="0" w:after="80"/>
-        <w:rPr/>
-      </w:pPr>
-      <w:r>
-        <w:rPr/>
-        <w:t>Versement du pot au bénéficiaire du tour (modes : virement, espèces, Mobile Money, chèque).</w:t>
-      </w:r>
-    </w:p>
-    <w:p>
-      <w:pPr>
-        <w:pStyle w:val="ListParagraph"/>
-        <w:numPr>
-          <w:ilvl w:val="0"/>
-          <w:numId w:val="1"/>
-        </w:numPr>
-        <w:spacing w:before="0" w:after="80"/>
-        <w:rPr/>
-      </w:pPr>
-      <w:r>
-        <w:rPr/>
-        <w:t>Suivi de la trésorerie du cycle (collecte, pénalités, distributions, solde).</w:t>
-      </w:r>
-    </w:p>
-    <w:p>
-      <w:pPr>
-        <w:pStyle w:val="ListParagraph"/>
-        <w:numPr>
-          <w:ilvl w:val="0"/>
-          <w:numId w:val="1"/>
-        </w:numPr>
-        <w:spacing w:before="0" w:after="80"/>
-        <w:rPr/>
-      </w:pPr>
-      <w:r>
-        <w:rPr/>
-        <w:t>Relance ou clôture d'un cycle.</w:t>
+        <w:t>4.5 Module Réunions et amendes</w:t>
+      </w:r>
+    </w:p>
+    <w:p>
+      <w:pPr>
+        <w:pStyle w:val="ListParagraph"/>
+        <w:numPr>
+          <w:ilvl w:val="0"/>
+          <w:numId w:val="2"/>
+        </w:numPr>
+        <w:spacing w:before="0" w:after="80"/>
+        <w:rPr/>
+      </w:pPr>
+      <w:r>
+        <w:rPr/>
+        <w:t>Création, modification, annulation et suppression de réunion.</w:t>
+      </w:r>
+    </w:p>
+    <w:p>
+      <w:pPr>
+        <w:pStyle w:val="ListParagraph"/>
+        <w:numPr>
+          <w:ilvl w:val="0"/>
+          <w:numId w:val="2"/>
+        </w:numPr>
+        <w:spacing w:before="0" w:after="80"/>
+        <w:rPr/>
+      </w:pPr>
+      <w:r>
+        <w:rPr/>
+        <w:t>Définition du type, lieu, date, ordre du jour et montant d'amende.</w:t>
+      </w:r>
+    </w:p>
+    <w:p>
+      <w:pPr>
+        <w:pStyle w:val="ListParagraph"/>
+        <w:numPr>
+          <w:ilvl w:val="0"/>
+          <w:numId w:val="2"/>
+        </w:numPr>
+        <w:spacing w:before="0" w:after="80"/>
+        <w:rPr/>
+      </w:pPr>
+      <w:r>
+        <w:rPr/>
+        <w:t>Signalement d'absence par le membre avant la réunion.</w:t>
+      </w:r>
+    </w:p>
+    <w:p>
+      <w:pPr>
+        <w:pStyle w:val="ListParagraph"/>
+        <w:numPr>
+          <w:ilvl w:val="0"/>
+          <w:numId w:val="2"/>
+        </w:numPr>
+        <w:spacing w:before="0" w:after="80"/>
+        <w:rPr/>
+      </w:pPr>
+      <w:r>
+        <w:rPr/>
+        <w:t>Enregistrement des présences (présent, absent, excusé, en retard).</w:t>
+      </w:r>
+    </w:p>
+    <w:p>
+      <w:pPr>
+        <w:pStyle w:val="ListParagraph"/>
+        <w:numPr>
+          <w:ilvl w:val="0"/>
+          <w:numId w:val="2"/>
+        </w:numPr>
+        <w:spacing w:before="0" w:after="80"/>
+        <w:rPr/>
+      </w:pPr>
+      <w:r>
+        <w:rPr/>
+        <w:t>Clôture de la réunion et encaissement des amendes.</w:t>
+      </w:r>
+    </w:p>
+    <w:p>
+      <w:pPr>
+        <w:pStyle w:val="ListParagraph"/>
+        <w:numPr>
+          <w:ilvl w:val="0"/>
+          <w:numId w:val="2"/>
+        </w:numPr>
+        <w:spacing w:before="0" w:after="80"/>
+        <w:rPr/>
+      </w:pPr>
+      <w:r>
+        <w:rPr/>
+        <w:t>Retrait depuis la caisse des amendes et consultation du compte rendu.</w:t>
       </w:r>
     </w:p>
     <w:p>
@@ -2585,67 +2761,97 @@
       </w:pPr>
       <w:r>
         <w:rPr/>
-        <w:t>4.4 Module Rubriques de cotisation</w:t>
-      </w:r>
-    </w:p>
-    <w:p>
-      <w:pPr>
-        <w:pStyle w:val="ListParagraph"/>
-        <w:numPr>
-          <w:ilvl w:val="0"/>
-          <w:numId w:val="1"/>
-        </w:numPr>
-        <w:spacing w:before="0" w:after="80"/>
-        <w:rPr/>
-      </w:pPr>
-      <w:r>
-        <w:rPr/>
-        <w:t>Création de rubriques (montant fixe, fréquence, durée, membres concernés).</w:t>
-      </w:r>
-    </w:p>
-    <w:p>
-      <w:pPr>
-        <w:pStyle w:val="ListParagraph"/>
-        <w:numPr>
-          <w:ilvl w:val="0"/>
-          <w:numId w:val="1"/>
-        </w:numPr>
-        <w:spacing w:before="0" w:after="80"/>
-        <w:rPr/>
-      </w:pPr>
-      <w:r>
-        <w:rPr/>
-        <w:t>Paiement d'une rubrique par membre ou par l'administrateur.</w:t>
-      </w:r>
-    </w:p>
-    <w:p>
-      <w:pPr>
-        <w:pStyle w:val="ListParagraph"/>
-        <w:numPr>
-          <w:ilvl w:val="0"/>
-          <w:numId w:val="1"/>
-        </w:numPr>
-        <w:spacing w:before="0" w:after="80"/>
-        <w:rPr/>
-      </w:pPr>
-      <w:r>
-        <w:rPr/>
-        <w:t>Retrait depuis une rubrique avec validation administrative.</w:t>
-      </w:r>
-    </w:p>
-    <w:p>
-      <w:pPr>
-        <w:pStyle w:val="ListParagraph"/>
-        <w:numPr>
-          <w:ilvl w:val="0"/>
-          <w:numId w:val="1"/>
-        </w:numPr>
-        <w:spacing w:before="0" w:after="80"/>
-        <w:rPr/>
-      </w:pPr>
-      <w:r>
-        <w:rPr/>
-        <w:t>Relance d'une rubrique expirée et notifications d'échéance.</w:t>
+        <w:t>4.6 Module Épargne</w:t>
+      </w:r>
+    </w:p>
+    <w:p>
+      <w:pPr>
+        <w:pStyle w:val="ListParagraph"/>
+        <w:numPr>
+          <w:ilvl w:val="0"/>
+          <w:numId w:val="2"/>
+        </w:numPr>
+        <w:spacing w:before="0" w:after="80"/>
+        <w:rPr/>
+      </w:pPr>
+      <w:r>
+        <w:rPr/>
+        <w:t>Ouverture d'un compte d'épargne par membre (numéro unique).</w:t>
+      </w:r>
+    </w:p>
+    <w:p>
+      <w:pPr>
+        <w:pStyle w:val="ListParagraph"/>
+        <w:numPr>
+          <w:ilvl w:val="0"/>
+          <w:numId w:val="2"/>
+        </w:numPr>
+        <w:spacing w:before="0" w:after="80"/>
+        <w:rPr/>
+      </w:pPr>
+      <w:r>
+        <w:rPr/>
+        <w:t>Dépôt et retrait sur un compte actif par l'administrateur.</w:t>
+      </w:r>
+    </w:p>
+    <w:p>
+      <w:pPr>
+        <w:pStyle w:val="ListParagraph"/>
+        <w:numPr>
+          <w:ilvl w:val="0"/>
+          <w:numId w:val="2"/>
+        </w:numPr>
+        <w:spacing w:before="0" w:after="80"/>
+        <w:rPr/>
+      </w:pPr>
+      <w:r>
+        <w:rPr/>
+        <w:t>Consultation des mouvements d'épargne par le membre.</w:t>
+      </w:r>
+    </w:p>
+    <w:p>
+      <w:pPr>
+        <w:pStyle w:val="ListParagraph"/>
+        <w:numPr>
+          <w:ilvl w:val="0"/>
+          <w:numId w:val="2"/>
+        </w:numPr>
+        <w:spacing w:before="0" w:after="80"/>
+        <w:rPr/>
+      </w:pPr>
+      <w:r>
+        <w:rPr/>
+        <w:t>Signalement d'un mouvement suspect par un membre.</w:t>
+      </w:r>
+    </w:p>
+    <w:p>
+      <w:pPr>
+        <w:pStyle w:val="ListParagraph"/>
+        <w:numPr>
+          <w:ilvl w:val="0"/>
+          <w:numId w:val="2"/>
+        </w:numPr>
+        <w:spacing w:before="0" w:after="80"/>
+        <w:rPr/>
+      </w:pPr>
+      <w:r>
+        <w:rPr/>
+        <w:t>Audit des comptes et mouvements (vue administrateur).</w:t>
+      </w:r>
+    </w:p>
+    <w:p>
+      <w:pPr>
+        <w:pStyle w:val="ListParagraph"/>
+        <w:numPr>
+          <w:ilvl w:val="0"/>
+          <w:numId w:val="2"/>
+        </w:numPr>
+        <w:spacing w:before="0" w:after="80"/>
+        <w:rPr/>
+      </w:pPr>
+      <w:r>
+        <w:rPr/>
+        <w:t>Blocage ou clôture d'un compte épargne.</w:t>
       </w:r>
     </w:p>
     <w:p>
@@ -2656,97 +2862,127 @@
       </w:pPr>
       <w:r>
         <w:rPr/>
-        <w:t>4.5 Module Réunions et amendes</w:t>
-      </w:r>
-    </w:p>
-    <w:p>
-      <w:pPr>
-        <w:pStyle w:val="ListParagraph"/>
-        <w:numPr>
-          <w:ilvl w:val="0"/>
-          <w:numId w:val="1"/>
-        </w:numPr>
-        <w:spacing w:before="0" w:after="80"/>
-        <w:rPr/>
-      </w:pPr>
-      <w:r>
-        <w:rPr/>
-        <w:t>Création, modification, annulation et suppression de réunion.</w:t>
-      </w:r>
-    </w:p>
-    <w:p>
-      <w:pPr>
-        <w:pStyle w:val="ListParagraph"/>
-        <w:numPr>
-          <w:ilvl w:val="0"/>
-          <w:numId w:val="1"/>
-        </w:numPr>
-        <w:spacing w:before="0" w:after="80"/>
-        <w:rPr/>
-      </w:pPr>
-      <w:r>
-        <w:rPr/>
-        <w:t>Définition du type, lieu, date, ordre du jour et montant d'amende.</w:t>
-      </w:r>
-    </w:p>
-    <w:p>
-      <w:pPr>
-        <w:pStyle w:val="ListParagraph"/>
-        <w:numPr>
-          <w:ilvl w:val="0"/>
-          <w:numId w:val="1"/>
-        </w:numPr>
-        <w:spacing w:before="0" w:after="80"/>
-        <w:rPr/>
-      </w:pPr>
-      <w:r>
-        <w:rPr/>
-        <w:t>Signalement d'absence par le membre avant la réunion.</w:t>
-      </w:r>
-    </w:p>
-    <w:p>
-      <w:pPr>
-        <w:pStyle w:val="ListParagraph"/>
-        <w:numPr>
-          <w:ilvl w:val="0"/>
-          <w:numId w:val="1"/>
-        </w:numPr>
-        <w:spacing w:before="0" w:after="80"/>
-        <w:rPr/>
-      </w:pPr>
-      <w:r>
-        <w:rPr/>
-        <w:t>Enregistrement des présences (présent, absent, excusé, en retard).</w:t>
-      </w:r>
-    </w:p>
-    <w:p>
-      <w:pPr>
-        <w:pStyle w:val="ListParagraph"/>
-        <w:numPr>
-          <w:ilvl w:val="0"/>
-          <w:numId w:val="1"/>
-        </w:numPr>
-        <w:spacing w:before="0" w:after="80"/>
-        <w:rPr/>
-      </w:pPr>
-      <w:r>
-        <w:rPr/>
-        <w:t>Clôture de la réunion et encaissement des amendes.</w:t>
-      </w:r>
-    </w:p>
-    <w:p>
-      <w:pPr>
-        <w:pStyle w:val="ListParagraph"/>
-        <w:numPr>
-          <w:ilvl w:val="0"/>
-          <w:numId w:val="1"/>
-        </w:numPr>
-        <w:spacing w:before="0" w:after="80"/>
-        <w:rPr/>
-      </w:pPr>
-      <w:r>
-        <w:rPr/>
-        <w:t>Retrait depuis la caisse des amendes et consultation du compte rendu.</w:t>
+        <w:t>4.7 Module Prêts internes</w:t>
+      </w:r>
+    </w:p>
+    <w:p>
+      <w:pPr>
+        <w:pStyle w:val="ListParagraph"/>
+        <w:numPr>
+          <w:ilvl w:val="0"/>
+          <w:numId w:val="2"/>
+        </w:numPr>
+        <w:spacing w:before="0" w:after="80"/>
+        <w:rPr/>
+      </w:pPr>
+      <w:r>
+        <w:rPr/>
+        <w:t>Configuration des paramètres de prêt (ancienneté minimale, plafond % banque, modèle de contrat avaliste).</w:t>
+      </w:r>
+    </w:p>
+    <w:p>
+      <w:pPr>
+        <w:pStyle w:val="ListParagraph"/>
+        <w:numPr>
+          <w:ilvl w:val="0"/>
+          <w:numId w:val="2"/>
+        </w:numPr>
+        <w:spacing w:before="0" w:after="80"/>
+        <w:rPr/>
+      </w:pPr>
+      <w:r>
+        <w:rPr/>
+        <w:t>Vérification automatique de l'éligibilité (ancienneté, solde épargne, prêt en cours, statut membre).</w:t>
+      </w:r>
+    </w:p>
+    <w:p>
+      <w:pPr>
+        <w:pStyle w:val="ListParagraph"/>
+        <w:numPr>
+          <w:ilvl w:val="0"/>
+          <w:numId w:val="2"/>
+        </w:numPr>
+        <w:spacing w:before="0" w:after="80"/>
+        <w:rPr/>
+      </w:pPr>
+      <w:r>
+        <w:rPr/>
+        <w:t>Soumission d'une demande de prêt par un membre (montant, durée, motif, avalistes).</w:t>
+      </w:r>
+    </w:p>
+    <w:p>
+      <w:pPr>
+        <w:pStyle w:val="ListParagraph"/>
+        <w:numPr>
+          <w:ilvl w:val="0"/>
+          <w:numId w:val="2"/>
+        </w:numPr>
+        <w:spacing w:before="0" w:after="80"/>
+        <w:rPr/>
+      </w:pPr>
+      <w:r>
+        <w:rPr/>
+        <w:t>Workflow avalistes : proposition, soumission de contrat, acceptation ou refus.</w:t>
+      </w:r>
+    </w:p>
+    <w:p>
+      <w:pPr>
+        <w:pStyle w:val="ListParagraph"/>
+        <w:numPr>
+          <w:ilvl w:val="0"/>
+          <w:numId w:val="2"/>
+        </w:numPr>
+        <w:spacing w:before="0" w:after="80"/>
+        <w:rPr/>
+      </w:pPr>
+      <w:r>
+        <w:rPr/>
+        <w:t>Analyse administrative : approbation, refus ou annulation avec motif.</w:t>
+      </w:r>
+    </w:p>
+    <w:p>
+      <w:pPr>
+        <w:pStyle w:val="ListParagraph"/>
+        <w:numPr>
+          <w:ilvl w:val="0"/>
+          <w:numId w:val="2"/>
+        </w:numPr>
+        <w:spacing w:before="0" w:after="80"/>
+        <w:rPr/>
+      </w:pPr>
+      <w:r>
+        <w:rPr/>
+        <w:t>Décaissement du prêt depuis la banque du groupe avec répartition proportionnelle.</w:t>
+      </w:r>
+    </w:p>
+    <w:p>
+      <w:pPr>
+        <w:pStyle w:val="ListParagraph"/>
+        <w:numPr>
+          <w:ilvl w:val="0"/>
+          <w:numId w:val="2"/>
+        </w:numPr>
+        <w:spacing w:before="0" w:after="80"/>
+        <w:rPr/>
+      </w:pPr>
+      <w:r>
+        <w:rPr/>
+        <w:t>Suivi du remboursement (capital, intérêts, retards, garanties).</w:t>
+      </w:r>
+    </w:p>
+    <w:p>
+      <w:pPr>
+        <w:pStyle w:val="ListParagraph"/>
+        <w:numPr>
+          <w:ilvl w:val="0"/>
+          <w:numId w:val="2"/>
+        </w:numPr>
+        <w:spacing w:before="0" w:after="80"/>
+        <w:rPr/>
+      </w:pPr>
+      <w:r>
+        <w:rPr/>
+        <w:t>Redistribution des intérêts collectés aux épargnants.</w:t>
       </w:r>
     </w:p>
     <w:p>
@@ -2757,97 +2993,97 @@
       </w:pPr>
       <w:r>
         <w:rPr/>
-        <w:t>4.6 Module Épargne</w:t>
-      </w:r>
-    </w:p>
-    <w:p>
-      <w:pPr>
-        <w:pStyle w:val="ListParagraph"/>
-        <w:numPr>
-          <w:ilvl w:val="0"/>
-          <w:numId w:val="1"/>
-        </w:numPr>
-        <w:spacing w:before="0" w:after="80"/>
-        <w:rPr/>
-      </w:pPr>
-      <w:r>
-        <w:rPr/>
-        <w:t>Ouverture d'un compte d'épargne par membre (numéro unique).</w:t>
-      </w:r>
-    </w:p>
-    <w:p>
-      <w:pPr>
-        <w:pStyle w:val="ListParagraph"/>
-        <w:numPr>
-          <w:ilvl w:val="0"/>
-          <w:numId w:val="1"/>
-        </w:numPr>
-        <w:spacing w:before="0" w:after="80"/>
-        <w:rPr/>
-      </w:pPr>
-      <w:r>
-        <w:rPr/>
-        <w:t>Dépôt et retrait sur un compte actif par l'administrateur.</w:t>
-      </w:r>
-    </w:p>
-    <w:p>
-      <w:pPr>
-        <w:pStyle w:val="ListParagraph"/>
-        <w:numPr>
-          <w:ilvl w:val="0"/>
-          <w:numId w:val="1"/>
-        </w:numPr>
-        <w:spacing w:before="0" w:after="80"/>
-        <w:rPr/>
-      </w:pPr>
-      <w:r>
-        <w:rPr/>
-        <w:t>Consultation des mouvements d'épargne par le membre.</w:t>
-      </w:r>
-    </w:p>
-    <w:p>
-      <w:pPr>
-        <w:pStyle w:val="ListParagraph"/>
-        <w:numPr>
-          <w:ilvl w:val="0"/>
-          <w:numId w:val="1"/>
-        </w:numPr>
-        <w:spacing w:before="0" w:after="80"/>
-        <w:rPr/>
-      </w:pPr>
-      <w:r>
-        <w:rPr/>
-        <w:t>Signalement d'un mouvement suspect par un membre.</w:t>
-      </w:r>
-    </w:p>
-    <w:p>
-      <w:pPr>
-        <w:pStyle w:val="ListParagraph"/>
-        <w:numPr>
-          <w:ilvl w:val="0"/>
-          <w:numId w:val="1"/>
-        </w:numPr>
-        <w:spacing w:before="0" w:after="80"/>
-        <w:rPr/>
-      </w:pPr>
-      <w:r>
-        <w:rPr/>
-        <w:t>Audit des comptes et mouvements (vue administrateur).</w:t>
-      </w:r>
-    </w:p>
-    <w:p>
-      <w:pPr>
-        <w:pStyle w:val="ListParagraph"/>
-        <w:numPr>
-          <w:ilvl w:val="0"/>
-          <w:numId w:val="1"/>
-        </w:numPr>
-        <w:spacing w:before="0" w:after="80"/>
-        <w:rPr/>
-      </w:pPr>
-      <w:r>
-        <w:rPr/>
-        <w:t>Blocage ou clôture d'un compte épargne.</w:t>
+        <w:t>4.8 Module Suivi financier et rapports</w:t>
+      </w:r>
+    </w:p>
+    <w:p>
+      <w:pPr>
+        <w:pStyle w:val="ListParagraph"/>
+        <w:numPr>
+          <w:ilvl w:val="0"/>
+          <w:numId w:val="2"/>
+        </w:numPr>
+        <w:spacing w:before="0" w:after="80"/>
+        <w:rPr/>
+      </w:pPr>
+      <w:r>
+        <w:rPr/>
+        <w:t>Création automatique de caisses financières (générale, cycle, rubriques, pénalités, amendes, intérêts prêts).</w:t>
+      </w:r>
+    </w:p>
+    <w:p>
+      <w:pPr>
+        <w:pStyle w:val="ListParagraph"/>
+        <w:numPr>
+          <w:ilvl w:val="0"/>
+          <w:numId w:val="2"/>
+        </w:numPr>
+        <w:spacing w:before="0" w:after="80"/>
+        <w:rPr/>
+      </w:pPr>
+      <w:r>
+        <w:rPr/>
+        <w:t>Journalisation de chaque entrée, sortie ou correction financière.</w:t>
+      </w:r>
+    </w:p>
+    <w:p>
+      <w:pPr>
+        <w:pStyle w:val="ListParagraph"/>
+        <w:numPr>
+          <w:ilvl w:val="0"/>
+          <w:numId w:val="2"/>
+        </w:numPr>
+        <w:spacing w:before="0" w:after="80"/>
+        <w:rPr/>
+      </w:pPr>
+      <w:r>
+        <w:rPr/>
+        <w:t>Consultation des soldes et mouvements financiers.</w:t>
+      </w:r>
+    </w:p>
+    <w:p>
+      <w:pPr>
+        <w:pStyle w:val="ListParagraph"/>
+        <w:numPr>
+          <w:ilvl w:val="0"/>
+          <w:numId w:val="2"/>
+        </w:numPr>
+        <w:spacing w:before="0" w:after="80"/>
+        <w:rPr/>
+      </w:pPr>
+      <w:r>
+        <w:rPr/>
+        <w:t>Export d'un rapport groupe en PDF et Excel.</w:t>
+      </w:r>
+    </w:p>
+    <w:p>
+      <w:pPr>
+        <w:pStyle w:val="ListParagraph"/>
+        <w:numPr>
+          <w:ilvl w:val="0"/>
+          <w:numId w:val="2"/>
+        </w:numPr>
+        <w:spacing w:before="0" w:after="80"/>
+        <w:rPr/>
+      </w:pPr>
+      <w:r>
+        <w:rPr/>
+        <w:t>Génération d'un relevé PDF individuel par membre.</w:t>
+      </w:r>
+    </w:p>
+    <w:p>
+      <w:pPr>
+        <w:pStyle w:val="ListParagraph"/>
+        <w:numPr>
+          <w:ilvl w:val="0"/>
+          <w:numId w:val="2"/>
+        </w:numPr>
+        <w:spacing w:before="0" w:after="80"/>
+        <w:rPr/>
+      </w:pPr>
+      <w:r>
+        <w:rPr/>
+        <w:t>Masquage d'historiques côté utilisateur sans suppression des données.</w:t>
       </w:r>
     </w:p>
     <w:p>
@@ -2858,131 +3094,106 @@
       </w:pPr>
       <w:r>
         <w:rPr/>
-        <w:t>4.7 Module Prêts internes</w:t>
-      </w:r>
-    </w:p>
-    <w:p>
-      <w:pPr>
-        <w:pStyle w:val="ListParagraph"/>
-        <w:numPr>
-          <w:ilvl w:val="0"/>
-          <w:numId w:val="1"/>
-        </w:numPr>
-        <w:spacing w:before="0" w:after="80"/>
-        <w:rPr/>
-      </w:pPr>
-      <w:r>
-        <w:rPr/>
-        <w:t>Configuration des paramètres de prêt (ancienneté minimale, plafond % banque, modèle de contrat avaliste).</w:t>
-      </w:r>
-    </w:p>
-    <w:p>
-      <w:pPr>
-        <w:pStyle w:val="ListParagraph"/>
-        <w:numPr>
-          <w:ilvl w:val="0"/>
-          <w:numId w:val="1"/>
-        </w:numPr>
-        <w:spacing w:before="0" w:after="80"/>
-        <w:rPr/>
-      </w:pPr>
-      <w:r>
-        <w:rPr/>
-        <w:t>Vérification automatique de l'éligibilité (ancienneté, solde épargne, prêt en cours, statut membre).</w:t>
-      </w:r>
-    </w:p>
-    <w:p>
-      <w:pPr>
-        <w:pStyle w:val="ListParagraph"/>
-        <w:numPr>
-          <w:ilvl w:val="0"/>
-          <w:numId w:val="1"/>
-        </w:numPr>
-        <w:spacing w:before="0" w:after="80"/>
-        <w:rPr/>
-      </w:pPr>
-      <w:r>
-        <w:rPr/>
-        <w:t>Soumission d'une demande de prêt par un membre (montant, durée, motif, avalistes).</w:t>
-      </w:r>
-    </w:p>
-    <w:p>
-      <w:pPr>
-        <w:pStyle w:val="ListParagraph"/>
-        <w:numPr>
-          <w:ilvl w:val="0"/>
-          <w:numId w:val="1"/>
-        </w:numPr>
-        <w:spacing w:before="0" w:after="80"/>
-        <w:rPr/>
-      </w:pPr>
-      <w:r>
-        <w:rPr/>
-        <w:t>Workflow avalistes : proposition, soumission de contrat, acceptation ou refus.</w:t>
-      </w:r>
-    </w:p>
-    <w:p>
-      <w:pPr>
-        <w:pStyle w:val="ListParagraph"/>
-        <w:numPr>
-          <w:ilvl w:val="0"/>
-          <w:numId w:val="1"/>
-        </w:numPr>
-        <w:spacing w:before="0" w:after="80"/>
-        <w:rPr/>
-      </w:pPr>
-      <w:r>
-        <w:rPr/>
-        <w:t>Analyse administrative : approbation, refus ou annulation avec motif.</w:t>
-      </w:r>
-    </w:p>
-    <w:p>
-      <w:pPr>
-        <w:pStyle w:val="ListParagraph"/>
-        <w:numPr>
-          <w:ilvl w:val="0"/>
-          <w:numId w:val="1"/>
-        </w:numPr>
-        <w:spacing w:before="0" w:after="80"/>
-        <w:rPr/>
-      </w:pPr>
-      <w:r>
-        <w:rPr/>
-        <w:t>Décaissement du prêt depuis la banque du groupe avec répartition proportionnelle.</w:t>
-      </w:r>
-    </w:p>
-    <w:p>
-      <w:pPr>
-        <w:pStyle w:val="ListParagraph"/>
-        <w:numPr>
-          <w:ilvl w:val="0"/>
-          <w:numId w:val="1"/>
-        </w:numPr>
-        <w:spacing w:before="0" w:after="80"/>
-        <w:rPr/>
-      </w:pPr>
-      <w:r>
-        <w:rPr/>
-        <w:t>S</w:t>
-      </w:r>
-      <w:r>
-        <w:rPr/>
-        <w:t>uivi du remboursement (capital, intérêts, retards, garanties).</w:t>
-      </w:r>
-    </w:p>
-    <w:p>
-      <w:pPr>
-        <w:pStyle w:val="ListParagraph"/>
-        <w:numPr>
-          <w:ilvl w:val="0"/>
-          <w:numId w:val="1"/>
-        </w:numPr>
-        <w:spacing w:before="0" w:after="80"/>
-        <w:rPr/>
-      </w:pPr>
-      <w:r>
-        <w:rPr/>
-        <w:t>Redistribution des intérêts collectés aux épargnants.</w:t>
+        <w:t>4.9 Module Notifications</w:t>
+      </w:r>
+    </w:p>
+    <w:p>
+      <w:pPr>
+        <w:pStyle w:val="ListParagraph"/>
+        <w:numPr>
+          <w:ilvl w:val="0"/>
+          <w:numId w:val="2"/>
+        </w:numPr>
+        <w:spacing w:before="0" w:after="80"/>
+        <w:rPr/>
+      </w:pPr>
+      <w:r>
+        <w:rPr/>
+        <w:t>Notification de création/modification de cycle, paiement, pénalité, versement du pot.</w:t>
+      </w:r>
+    </w:p>
+    <w:p>
+      <w:pPr>
+        <w:pStyle w:val="ListParagraph"/>
+        <w:numPr>
+          <w:ilvl w:val="0"/>
+          <w:numId w:val="2"/>
+        </w:numPr>
+        <w:spacing w:before="0" w:after="80"/>
+        <w:rPr/>
+      </w:pPr>
+      <w:r>
+        <w:rPr/>
+        <w:t>Notification d'invitation, demande de réintégration et changement de rôle.</w:t>
+      </w:r>
+    </w:p>
+    <w:p>
+      <w:pPr>
+        <w:pStyle w:val="ListParagraph"/>
+        <w:numPr>
+          <w:ilvl w:val="0"/>
+          <w:numId w:val="2"/>
+        </w:numPr>
+        <w:spacing w:before="0" w:after="80"/>
+        <w:rPr/>
+      </w:pPr>
+      <w:r>
+        <w:rPr/>
+        <w:t>Notification de réunion, présence, absence, amende et rappel de rubrique.</w:t>
+      </w:r>
+    </w:p>
+    <w:p>
+      <w:pPr>
+        <w:pStyle w:val="ListParagraph"/>
+        <w:numPr>
+          <w:ilvl w:val="0"/>
+          <w:numId w:val="2"/>
+        </w:numPr>
+        <w:spacing w:before="0" w:after="80"/>
+        <w:rPr/>
+      </w:pPr>
+      <w:r>
+        <w:rPr/>
+        <w:t>Notification liée à l'épargne et aux prêts (demande, approbation, décaissement, retard).</w:t>
+      </w:r>
+    </w:p>
+    <w:p>
+      <w:pPr>
+        <w:pStyle w:val="ListParagraph"/>
+        <w:numPr>
+          <w:ilvl w:val="0"/>
+          <w:numId w:val="2"/>
+        </w:numPr>
+        <w:spacing w:before="0" w:after="80"/>
+        <w:rPr/>
+      </w:pPr>
+      <w:r>
+        <w:rPr/>
+        <w:t>Lecture, suppression unitaire et suppression globale des notifications.</w:t>
+      </w:r>
+      <w:r>
+        <w:br w:type="page"/>
+      </w:r>
+    </w:p>
+    <w:p>
+      <w:pPr>
+        <w:pStyle w:val="Normal"/>
+        <w:spacing w:before="0" w:after="0"/>
+        <w:rPr/>
+      </w:pPr>
+      <w:r>
+        <w:rPr/>
+      </w:r>
+    </w:p>
+    <w:p>
+      <w:pPr>
+        <w:pStyle w:val="Heading1"/>
+        <w:spacing w:before="400" w:after="200"/>
+        <w:rPr/>
+      </w:pPr>
+      <w:r>
+        <w:rPr/>
+        <w:t>V. Besoins Non-Fonctionnels et Exigences</w:t>
       </w:r>
     </w:p>
     <w:p>
@@ -2993,97 +3204,97 @@
       </w:pPr>
       <w:r>
         <w:rPr/>
-        <w:t>4.8 Module Suivi financier et rapports</w:t>
-      </w:r>
-    </w:p>
-    <w:p>
-      <w:pPr>
-        <w:pStyle w:val="ListParagraph"/>
-        <w:numPr>
-          <w:ilvl w:val="0"/>
-          <w:numId w:val="1"/>
-        </w:numPr>
-        <w:spacing w:before="0" w:after="80"/>
-        <w:rPr/>
-      </w:pPr>
-      <w:r>
-        <w:rPr/>
-        <w:t>Création automatique de caisses financières (générale, cycle, rubriques, pénalités, amendes, intérêts prêts).</w:t>
-      </w:r>
-    </w:p>
-    <w:p>
-      <w:pPr>
-        <w:pStyle w:val="ListParagraph"/>
-        <w:numPr>
-          <w:ilvl w:val="0"/>
-          <w:numId w:val="1"/>
-        </w:numPr>
-        <w:spacing w:before="0" w:after="80"/>
-        <w:rPr/>
-      </w:pPr>
-      <w:r>
-        <w:rPr/>
-        <w:t>Journalisation de chaque entrée, sortie ou correction financière.</w:t>
-      </w:r>
-    </w:p>
-    <w:p>
-      <w:pPr>
-        <w:pStyle w:val="ListParagraph"/>
-        <w:numPr>
-          <w:ilvl w:val="0"/>
-          <w:numId w:val="1"/>
-        </w:numPr>
-        <w:spacing w:before="0" w:after="80"/>
-        <w:rPr/>
-      </w:pPr>
-      <w:r>
-        <w:rPr/>
-        <w:t>Consultation des soldes et mouvements financiers.</w:t>
-      </w:r>
-    </w:p>
-    <w:p>
-      <w:pPr>
-        <w:pStyle w:val="ListParagraph"/>
-        <w:numPr>
-          <w:ilvl w:val="0"/>
-          <w:numId w:val="1"/>
-        </w:numPr>
-        <w:spacing w:before="0" w:after="80"/>
-        <w:rPr/>
-      </w:pPr>
-      <w:r>
-        <w:rPr/>
-        <w:t>Export d'un rapport groupe en PDF et Excel.</w:t>
-      </w:r>
-    </w:p>
-    <w:p>
-      <w:pPr>
-        <w:pStyle w:val="ListParagraph"/>
-        <w:numPr>
-          <w:ilvl w:val="0"/>
-          <w:numId w:val="1"/>
-        </w:numPr>
-        <w:spacing w:before="0" w:after="80"/>
-        <w:rPr/>
-      </w:pPr>
-      <w:r>
-        <w:rPr/>
-        <w:t>Génération d'un relevé PDF individuel par membre.</w:t>
-      </w:r>
-    </w:p>
-    <w:p>
-      <w:pPr>
-        <w:pStyle w:val="ListParagraph"/>
-        <w:numPr>
-          <w:ilvl w:val="0"/>
-          <w:numId w:val="1"/>
-        </w:numPr>
-        <w:spacing w:before="0" w:after="80"/>
-        <w:rPr/>
-      </w:pPr>
-      <w:r>
-        <w:rPr/>
-        <w:t>Masquage d'historiques côté utilisateur sans suppression des données.</w:t>
+        <w:t>5.1 Sécurité</w:t>
+      </w:r>
+    </w:p>
+    <w:p>
+      <w:pPr>
+        <w:pStyle w:val="ListParagraph"/>
+        <w:numPr>
+          <w:ilvl w:val="0"/>
+          <w:numId w:val="2"/>
+        </w:numPr>
+        <w:spacing w:before="0" w:after="80"/>
+        <w:rPr/>
+      </w:pPr>
+      <w:r>
+        <w:rPr/>
+        <w:t>Les mots de passe sont gérés par Supabase Auth et ne sont pas stockés en clair dans la base métier.</w:t>
+      </w:r>
+    </w:p>
+    <w:p>
+      <w:pPr>
+        <w:pStyle w:val="ListParagraph"/>
+        <w:numPr>
+          <w:ilvl w:val="0"/>
+          <w:numId w:val="2"/>
+        </w:numPr>
+        <w:spacing w:before="0" w:after="80"/>
+        <w:rPr/>
+      </w:pPr>
+      <w:r>
+        <w:rPr/>
+        <w:t>Les routes sensibles vérifient l'utilisateur connecté et son appartenance au groupe.</w:t>
+      </w:r>
+    </w:p>
+    <w:p>
+      <w:pPr>
+        <w:pStyle w:val="ListParagraph"/>
+        <w:numPr>
+          <w:ilvl w:val="0"/>
+          <w:numId w:val="2"/>
+        </w:numPr>
+        <w:spacing w:before="0" w:after="80"/>
+        <w:rPr/>
+      </w:pPr>
+      <w:r>
+        <w:rPr/>
+        <w:t>Les actions d'administration exigent un membre actif avec rôle ADMIN.</w:t>
+      </w:r>
+    </w:p>
+    <w:p>
+      <w:pPr>
+        <w:pStyle w:val="ListParagraph"/>
+        <w:numPr>
+          <w:ilvl w:val="0"/>
+          <w:numId w:val="2"/>
+        </w:numPr>
+        <w:spacing w:before="0" w:after="80"/>
+        <w:rPr/>
+      </w:pPr>
+      <w:r>
+        <w:rPr/>
+        <w:t>Les données d'un groupe ne sont accessibles qu'aux membres autorisés.</w:t>
+      </w:r>
+    </w:p>
+    <w:p>
+      <w:pPr>
+        <w:pStyle w:val="ListParagraph"/>
+        <w:numPr>
+          <w:ilvl w:val="0"/>
+          <w:numId w:val="2"/>
+        </w:numPr>
+        <w:spacing w:before="0" w:after="80"/>
+        <w:rPr/>
+      </w:pPr>
+      <w:r>
+        <w:rPr/>
+        <w:t>L'autorisation ne repose jamais sur user_metadata Supabase (modifiable par l'utilisateur).</w:t>
+      </w:r>
+    </w:p>
+    <w:p>
+      <w:pPr>
+        <w:pStyle w:val="ListParagraph"/>
+        <w:numPr>
+          <w:ilvl w:val="0"/>
+          <w:numId w:val="2"/>
+        </w:numPr>
+        <w:spacing w:before="0" w:after="80"/>
+        <w:rPr/>
+      </w:pPr>
+      <w:r>
+        <w:rPr/>
+        <w:t>Les variables sensibles (clés API, URLs base de données) sont stockées dans des fichiers d'environnement.</w:t>
       </w:r>
     </w:p>
     <w:p>
@@ -3094,105 +3305,52 @@
       </w:pPr>
       <w:r>
         <w:rPr/>
-        <w:t>4.9 Module Notifications</w:t>
-      </w:r>
-    </w:p>
-    <w:p>
-      <w:pPr>
-        <w:pStyle w:val="ListParagraph"/>
-        <w:numPr>
-          <w:ilvl w:val="0"/>
-          <w:numId w:val="1"/>
-        </w:numPr>
-        <w:spacing w:before="0" w:after="80"/>
-        <w:rPr/>
-      </w:pPr>
-      <w:r>
-        <w:rPr/>
-        <w:t>Notification de création/modification de cycle, paiement, pénalité, versement du pot.</w:t>
-      </w:r>
-    </w:p>
-    <w:p>
-      <w:pPr>
-        <w:pStyle w:val="ListParagraph"/>
-        <w:numPr>
-          <w:ilvl w:val="0"/>
-          <w:numId w:val="1"/>
-        </w:numPr>
-        <w:spacing w:before="0" w:after="80"/>
-        <w:rPr/>
-      </w:pPr>
-      <w:r>
-        <w:rPr/>
-        <w:t>Notification d'invitation, demande de réintégration et changement de rôle.</w:t>
-      </w:r>
-    </w:p>
-    <w:p>
-      <w:pPr>
-        <w:pStyle w:val="ListParagraph"/>
-        <w:numPr>
-          <w:ilvl w:val="0"/>
-          <w:numId w:val="1"/>
-        </w:numPr>
-        <w:spacing w:before="0" w:after="80"/>
-        <w:rPr/>
-      </w:pPr>
-      <w:r>
-        <w:rPr/>
-        <w:t>Notification de réunion, présence, absence, amende et rappel de rubrique.</w:t>
-      </w:r>
-    </w:p>
-    <w:p>
-      <w:pPr>
-        <w:pStyle w:val="ListParagraph"/>
-        <w:numPr>
-          <w:ilvl w:val="0"/>
-          <w:numId w:val="1"/>
-        </w:numPr>
-        <w:spacing w:before="0" w:after="80"/>
-        <w:rPr/>
-      </w:pPr>
-      <w:r>
-        <w:rPr/>
-        <w:t>Notification liée à l'épargne et aux prêts (demande, approbation, décaissement, retard).</w:t>
-      </w:r>
-    </w:p>
-    <w:p>
-      <w:pPr>
-        <w:pStyle w:val="ListParagraph"/>
-        <w:numPr>
-          <w:ilvl w:val="0"/>
-          <w:numId w:val="1"/>
-        </w:numPr>
-        <w:spacing w:before="0" w:after="80"/>
-        <w:rPr/>
-      </w:pPr>
-      <w:r>
-        <w:rPr/>
-        <w:t>Lecture, suppression unitaire et suppression globale des notifications.</w:t>
-      </w:r>
-      <w:r>
-        <w:br w:type="page"/>
-      </w:r>
-    </w:p>
-    <w:p>
-      <w:pPr>
-        <w:pStyle w:val="Normal"/>
-        <w:rPr/>
-      </w:pPr>
-      <w:r>
-        <w:rPr/>
-      </w:r>
-    </w:p>
-    <w:p>
-      <w:pPr>
-        <w:pStyle w:val="Heading1"/>
-        <w:spacing w:before="400" w:after="200"/>
-        <w:rPr/>
-      </w:pPr>
-      <w:r>
-        <w:rPr/>
-        <w:t>V. Besoins Non-Fonctionnels et Exigences</w:t>
+        <w:t>5.2 Performance</w:t>
+      </w:r>
+    </w:p>
+    <w:p>
+      <w:pPr>
+        <w:pStyle w:val="ListParagraph"/>
+        <w:numPr>
+          <w:ilvl w:val="0"/>
+          <w:numId w:val="2"/>
+        </w:numPr>
+        <w:spacing w:before="0" w:after="80"/>
+        <w:rPr/>
+      </w:pPr>
+      <w:r>
+        <w:rPr/>
+        <w:t>Les opérations courantes (tableau de bord, enregistrement de paiement, liste des membres) doivent répondre en moins de 3 secondes.</w:t>
+      </w:r>
+    </w:p>
+    <w:p>
+      <w:pPr>
+        <w:pStyle w:val="ListParagraph"/>
+        <w:numPr>
+          <w:ilvl w:val="0"/>
+          <w:numId w:val="2"/>
+        </w:numPr>
+        <w:spacing w:before="0" w:after="80"/>
+        <w:rPr/>
+      </w:pPr>
+      <w:r>
+        <w:rPr/>
+        <w:t>Les requêtes Prisma utilisent des sélections ciblées (select) pour limiter le sur-fetching.</w:t>
+      </w:r>
+    </w:p>
+    <w:p>
+      <w:pPr>
+        <w:pStyle w:val="ListParagraph"/>
+        <w:numPr>
+          <w:ilvl w:val="0"/>
+          <w:numId w:val="2"/>
+        </w:numPr>
+        <w:spacing w:before="0" w:after="80"/>
+        <w:rPr/>
+      </w:pPr>
+      <w:r>
+        <w:rPr/>
+        <w:t>Les exports PDF/Excel sont générés à la demande, pas en temps réel continu.</w:t>
       </w:r>
     </w:p>
     <w:p>
@@ -3203,97 +3361,82 @@
       </w:pPr>
       <w:r>
         <w:rPr/>
-        <w:t>5.1 Sécurité</w:t>
-      </w:r>
-    </w:p>
-    <w:p>
-      <w:pPr>
-        <w:pStyle w:val="ListParagraph"/>
-        <w:numPr>
-          <w:ilvl w:val="0"/>
-          <w:numId w:val="1"/>
-        </w:numPr>
-        <w:spacing w:before="0" w:after="80"/>
-        <w:rPr/>
-      </w:pPr>
-      <w:r>
-        <w:rPr/>
-        <w:t>Les mots de passe sont gérés par Supabase Auth et ne sont pas stockés en clair dans la base métier.</w:t>
-      </w:r>
-    </w:p>
-    <w:p>
-      <w:pPr>
-        <w:pStyle w:val="ListParagraph"/>
-        <w:numPr>
-          <w:ilvl w:val="0"/>
-          <w:numId w:val="1"/>
-        </w:numPr>
-        <w:spacing w:before="0" w:after="80"/>
-        <w:rPr/>
-      </w:pPr>
-      <w:r>
-        <w:rPr/>
-        <w:t>Les routes sensibles vérifient l'utilisateur connecté et son appartenance au groupe.</w:t>
-      </w:r>
-    </w:p>
-    <w:p>
-      <w:pPr>
-        <w:pStyle w:val="ListParagraph"/>
-        <w:numPr>
-          <w:ilvl w:val="0"/>
-          <w:numId w:val="1"/>
-        </w:numPr>
-        <w:spacing w:before="0" w:after="80"/>
-        <w:rPr/>
-      </w:pPr>
-      <w:r>
-        <w:rPr/>
-        <w:t>Les actions d'administration exigent un membre actif avec rôle ADMIN.</w:t>
-      </w:r>
-    </w:p>
-    <w:p>
-      <w:pPr>
-        <w:pStyle w:val="ListParagraph"/>
-        <w:numPr>
-          <w:ilvl w:val="0"/>
-          <w:numId w:val="1"/>
-        </w:numPr>
-        <w:spacing w:before="0" w:after="80"/>
-        <w:rPr/>
-      </w:pPr>
-      <w:r>
-        <w:rPr/>
-        <w:t>Les données d'un groupe ne sont accessibles qu'aux membres autorisés.</w:t>
-      </w:r>
-    </w:p>
-    <w:p>
-      <w:pPr>
-        <w:pStyle w:val="ListParagraph"/>
-        <w:numPr>
-          <w:ilvl w:val="0"/>
-          <w:numId w:val="1"/>
-        </w:numPr>
-        <w:spacing w:before="0" w:after="80"/>
-        <w:rPr/>
-      </w:pPr>
-      <w:r>
-        <w:rPr/>
-        <w:t>L'autorisation ne repose jamais sur user_metadata Supabase (modifiable par l'utilisateur).</w:t>
-      </w:r>
-    </w:p>
-    <w:p>
-      <w:pPr>
-        <w:pStyle w:val="ListParagraph"/>
-        <w:numPr>
-          <w:ilvl w:val="0"/>
-          <w:numId w:val="1"/>
-        </w:numPr>
-        <w:spacing w:before="0" w:after="80"/>
-        <w:rPr/>
-      </w:pPr>
-      <w:r>
-        <w:rPr/>
-        <w:t>Les variables sensibles (clés API, URLs base de données) sont stockées dans des fichiers d'environnement.</w:t>
+        <w:t>5.3 Accessibilité et ergonomie</w:t>
+      </w:r>
+    </w:p>
+    <w:p>
+      <w:pPr>
+        <w:pStyle w:val="ListParagraph"/>
+        <w:numPr>
+          <w:ilvl w:val="0"/>
+          <w:numId w:val="2"/>
+        </w:numPr>
+        <w:spacing w:before="0" w:after="80"/>
+        <w:rPr/>
+      </w:pPr>
+      <w:r>
+        <w:rPr/>
+        <w:t>Interface responsive (ordinateur, tablette, smartphone).</w:t>
+      </w:r>
+    </w:p>
+    <w:p>
+      <w:pPr>
+        <w:pStyle w:val="ListParagraph"/>
+        <w:numPr>
+          <w:ilvl w:val="0"/>
+          <w:numId w:val="2"/>
+        </w:numPr>
+        <w:spacing w:before="0" w:after="80"/>
+        <w:rPr/>
+      </w:pPr>
+      <w:r>
+        <w:rPr/>
+        <w:t>Interface en français (support anglais prévu via i18n).</w:t>
+      </w:r>
+    </w:p>
+    <w:p>
+      <w:pPr>
+        <w:pStyle w:val="ListParagraph"/>
+        <w:numPr>
+          <w:ilvl w:val="0"/>
+          <w:numId w:val="2"/>
+        </w:numPr>
+        <w:spacing w:before="0" w:after="80"/>
+        <w:rPr/>
+      </w:pPr>
+      <w:r>
+        <w:rPr/>
+        <w:t>Navigation séparée entre vue publique, authentification, tableau de bord et modules internes.</w:t>
+      </w:r>
+    </w:p>
+    <w:p>
+      <w:pPr>
+        <w:pStyle w:val="ListParagraph"/>
+        <w:numPr>
+          <w:ilvl w:val="0"/>
+          <w:numId w:val="2"/>
+        </w:numPr>
+        <w:spacing w:before="0" w:after="80"/>
+        <w:rPr/>
+      </w:pPr>
+      <w:r>
+        <w:rPr/>
+        <w:t>Feedback visuel par statut (vert/rouge) pour la discipline des membres.</w:t>
+      </w:r>
+    </w:p>
+    <w:p>
+      <w:pPr>
+        <w:pStyle w:val="ListParagraph"/>
+        <w:numPr>
+          <w:ilvl w:val="0"/>
+          <w:numId w:val="2"/>
+        </w:numPr>
+        <w:spacing w:before="0" w:after="80"/>
+        <w:rPr/>
+      </w:pPr>
+      <w:r>
+        <w:rPr/>
+        <w:t>Montants affichés en FCFA/XAF avec formatage localisé.</w:t>
       </w:r>
     </w:p>
     <w:p>
@@ -3304,52 +3447,82 @@
       </w:pPr>
       <w:r>
         <w:rPr/>
-        <w:t>5.2 Performance</w:t>
-      </w:r>
-    </w:p>
-    <w:p>
-      <w:pPr>
-        <w:pStyle w:val="ListParagraph"/>
-        <w:numPr>
-          <w:ilvl w:val="0"/>
-          <w:numId w:val="1"/>
-        </w:numPr>
-        <w:spacing w:before="0" w:after="80"/>
-        <w:rPr/>
-      </w:pPr>
-      <w:r>
-        <w:rPr/>
-        <w:t>Les opérations courantes (tableau de bord, enregistrement de paiement, liste des membres) doivent répondre en moins de 3 secondes.</w:t>
-      </w:r>
-    </w:p>
-    <w:p>
-      <w:pPr>
-        <w:pStyle w:val="ListParagraph"/>
-        <w:numPr>
-          <w:ilvl w:val="0"/>
-          <w:numId w:val="1"/>
-        </w:numPr>
-        <w:spacing w:before="0" w:after="80"/>
-        <w:rPr/>
-      </w:pPr>
-      <w:r>
-        <w:rPr/>
-        <w:t>Les requêtes Prisma utilisent des sélections ciblées (select) pour limiter le sur-fetching.</w:t>
-      </w:r>
-    </w:p>
-    <w:p>
-      <w:pPr>
-        <w:pStyle w:val="ListParagraph"/>
-        <w:numPr>
-          <w:ilvl w:val="0"/>
-          <w:numId w:val="1"/>
-        </w:numPr>
-        <w:spacing w:before="0" w:after="80"/>
-        <w:rPr/>
-      </w:pPr>
-      <w:r>
-        <w:rPr/>
-        <w:t>Les exports PDF/Excel sont générés à la demande, pas en temps réel continu.</w:t>
+        <w:t>5.4 Maintenabilité</w:t>
+      </w:r>
+    </w:p>
+    <w:p>
+      <w:pPr>
+        <w:pStyle w:val="ListParagraph"/>
+        <w:numPr>
+          <w:ilvl w:val="0"/>
+          <w:numId w:val="2"/>
+        </w:numPr>
+        <w:spacing w:before="0" w:after="80"/>
+        <w:rPr/>
+      </w:pPr>
+      <w:r>
+        <w:rPr/>
+        <w:t>Architecture Next.js App Router avec composants React, API Routes et Server Actions.</w:t>
+      </w:r>
+    </w:p>
+    <w:p>
+      <w:pPr>
+        <w:pStyle w:val="ListParagraph"/>
+        <w:numPr>
+          <w:ilvl w:val="0"/>
+          <w:numId w:val="2"/>
+        </w:numPr>
+        <w:spacing w:before="0" w:after="80"/>
+        <w:rPr/>
+      </w:pPr>
+      <w:r>
+        <w:rPr/>
+        <w:t>Validation des entrées avec Zod (lib/validations.ts).</w:t>
+      </w:r>
+    </w:p>
+    <w:p>
+      <w:pPr>
+        <w:pStyle w:val="ListParagraph"/>
+        <w:numPr>
+          <w:ilvl w:val="0"/>
+          <w:numId w:val="2"/>
+        </w:numPr>
+        <w:spacing w:before="0" w:after="80"/>
+        <w:rPr/>
+      </w:pPr>
+      <w:r>
+        <w:rPr/>
+        <w:t>Séparation des services métier (lib/pret.ts, lib/epargne.ts, lib/notifications.ts, etc.).</w:t>
+      </w:r>
+    </w:p>
+    <w:p>
+      <w:pPr>
+        <w:pStyle w:val="ListParagraph"/>
+        <w:numPr>
+          <w:ilvl w:val="0"/>
+          <w:numId w:val="2"/>
+        </w:numPr>
+        <w:spacing w:before="0" w:after="80"/>
+        <w:rPr/>
+      </w:pPr>
+      <w:r>
+        <w:rPr/>
+        <w:t>Schéma relationnel centralisé dans prisma/schema.prisma.</w:t>
+      </w:r>
+    </w:p>
+    <w:p>
+      <w:pPr>
+        <w:pStyle w:val="ListParagraph"/>
+        <w:numPr>
+          <w:ilvl w:val="0"/>
+          <w:numId w:val="2"/>
+        </w:numPr>
+        <w:spacing w:before="0" w:after="80"/>
+        <w:rPr/>
+      </w:pPr>
+      <w:r>
+        <w:rPr/>
+        <w:t>Documentation fonctionnelle maintenue dans le dossier Docs/.</w:t>
       </w:r>
     </w:p>
     <w:p>
@@ -3360,178 +3533,6 @@
       </w:pPr>
       <w:r>
         <w:rPr/>
-        <w:t>5.3 Accessibilité et ergonomie</w:t>
-      </w:r>
-    </w:p>
-    <w:p>
-      <w:pPr>
-        <w:pStyle w:val="ListParagraph"/>
-        <w:numPr>
-          <w:ilvl w:val="0"/>
-          <w:numId w:val="1"/>
-        </w:numPr>
-        <w:spacing w:before="0" w:after="80"/>
-        <w:rPr/>
-      </w:pPr>
-      <w:r>
-        <w:rPr/>
-        <w:t>Interface responsive (ordinateur, tablette, smartphone).</w:t>
-      </w:r>
-    </w:p>
-    <w:p>
-      <w:pPr>
-        <w:pStyle w:val="ListParagraph"/>
-        <w:numPr>
-          <w:ilvl w:val="0"/>
-          <w:numId w:val="1"/>
-        </w:numPr>
-        <w:spacing w:before="0" w:after="80"/>
-        <w:rPr/>
-      </w:pPr>
-      <w:r>
-        <w:rPr/>
-        <w:t>Interface en français (support anglais prévu via i18n).</w:t>
-      </w:r>
-    </w:p>
-    <w:p>
-      <w:pPr>
-        <w:pStyle w:val="ListParagraph"/>
-        <w:numPr>
-          <w:ilvl w:val="0"/>
-          <w:numId w:val="1"/>
-        </w:numPr>
-        <w:spacing w:before="0" w:after="80"/>
-        <w:rPr/>
-      </w:pPr>
-      <w:r>
-        <w:rPr/>
-        <w:t>Navigation séparée entre vue publique, authentification, tableau de bord et modules internes.</w:t>
-      </w:r>
-    </w:p>
-    <w:p>
-      <w:pPr>
-        <w:pStyle w:val="ListParagraph"/>
-        <w:numPr>
-          <w:ilvl w:val="0"/>
-          <w:numId w:val="1"/>
-        </w:numPr>
-        <w:spacing w:before="0" w:after="80"/>
-        <w:rPr/>
-      </w:pPr>
-      <w:r>
-        <w:rPr/>
-        <w:t>Feedback visuel par statut (vert/rouge) pour la discipline des membres.</w:t>
-      </w:r>
-    </w:p>
-    <w:p>
-      <w:pPr>
-        <w:pStyle w:val="ListParagraph"/>
-        <w:numPr>
-          <w:ilvl w:val="0"/>
-          <w:numId w:val="1"/>
-        </w:numPr>
-        <w:spacing w:before="0" w:after="80"/>
-        <w:rPr/>
-      </w:pPr>
-      <w:r>
-        <w:rPr/>
-        <w:t>Montants affichés en FCFA/XAF avec formatage localisé.</w:t>
-      </w:r>
-    </w:p>
-    <w:p>
-      <w:pPr>
-        <w:pStyle w:val="Heading2"/>
-        <w:spacing w:before="300" w:after="150"/>
-        <w:rPr/>
-      </w:pPr>
-      <w:r>
-        <w:rPr/>
-        <w:t>5.4 Maintenabilité</w:t>
-      </w:r>
-    </w:p>
-    <w:p>
-      <w:pPr>
-        <w:pStyle w:val="ListParagraph"/>
-        <w:numPr>
-          <w:ilvl w:val="0"/>
-          <w:numId w:val="1"/>
-        </w:numPr>
-        <w:spacing w:before="0" w:after="80"/>
-        <w:rPr/>
-      </w:pPr>
-      <w:r>
-        <w:rPr/>
-        <w:t>Architecture Next.js App Router avec composants React, API Routes et Server Actions.</w:t>
-      </w:r>
-    </w:p>
-    <w:p>
-      <w:pPr>
-        <w:pStyle w:val="ListParagraph"/>
-        <w:numPr>
-          <w:ilvl w:val="0"/>
-          <w:numId w:val="1"/>
-        </w:numPr>
-        <w:spacing w:before="0" w:after="80"/>
-        <w:rPr/>
-      </w:pPr>
-      <w:r>
-        <w:rPr/>
-        <w:t>Validation des entrées avec Zod (lib/validations.ts).</w:t>
-      </w:r>
-    </w:p>
-    <w:p>
-      <w:pPr>
-        <w:pStyle w:val="ListParagraph"/>
-        <w:numPr>
-          <w:ilvl w:val="0"/>
-          <w:numId w:val="1"/>
-        </w:numPr>
-        <w:spacing w:before="0" w:after="80"/>
-        <w:rPr/>
-      </w:pPr>
-      <w:r>
-        <w:rPr/>
-        <w:t>Séparation des services métier (lib/pret.ts, lib/epargne.ts, lib/notifications.ts, etc.).</w:t>
-      </w:r>
-    </w:p>
-    <w:p>
-      <w:pPr>
-        <w:pStyle w:val="ListParagraph"/>
-        <w:numPr>
-          <w:ilvl w:val="0"/>
-          <w:numId w:val="1"/>
-        </w:numPr>
-        <w:spacing w:before="0" w:after="80"/>
-        <w:rPr/>
-      </w:pPr>
-      <w:r>
-        <w:rPr/>
-        <w:t>Schéma relationnel centralisé dans prisma/schema.prisma.</w:t>
-      </w:r>
-    </w:p>
-    <w:p>
-      <w:pPr>
-        <w:pStyle w:val="ListParagraph"/>
-        <w:numPr>
-          <w:ilvl w:val="0"/>
-          <w:numId w:val="1"/>
-        </w:numPr>
-        <w:spacing w:before="0" w:after="80"/>
-        <w:rPr/>
-      </w:pPr>
-      <w:r>
-        <w:rPr/>
-        <w:t>Documentation fonctionnelle maintenue dans le dossier Docs/.</w:t>
-      </w:r>
-    </w:p>
-    <w:p>
-      <w:pPr>
-        <w:pStyle w:val="Heading2"/>
-        <w:spacing w:before="300" w:after="150"/>
-        <w:rPr/>
-      </w:pPr>
-      <w:r>
-        <w:rPr/>
         <w:t>5.5 Disponibilité et déploiement</w:t>
       </w:r>
     </w:p>
@@ -3540,7 +3541,7 @@
         <w:pStyle w:val="ListParagraph"/>
         <w:numPr>
           <w:ilvl w:val="0"/>
-          <w:numId w:val="1"/>
+          <w:numId w:val="2"/>
         </w:numPr>
         <w:spacing w:before="0" w:after="80"/>
         <w:rPr/>
@@ -3555,7 +3556,7 @@
         <w:pStyle w:val="ListParagraph"/>
         <w:numPr>
           <w:ilvl w:val="0"/>
-          <w:numId w:val="1"/>
+          <w:numId w:val="2"/>
         </w:numPr>
         <w:spacing w:before="0" w:after="80"/>
         <w:rPr/>
@@ -3570,7 +3571,7 @@
         <w:pStyle w:val="ListParagraph"/>
         <w:numPr>
           <w:ilvl w:val="0"/>
-          <w:numId w:val="1"/>
+          <w:numId w:val="2"/>
         </w:numPr>
         <w:spacing w:before="0" w:after="80"/>
         <w:rPr/>
@@ -3585,7 +3586,7 @@
         <w:pStyle w:val="ListParagraph"/>
         <w:numPr>
           <w:ilvl w:val="0"/>
-          <w:numId w:val="1"/>
+          <w:numId w:val="2"/>
         </w:numPr>
         <w:spacing w:before="0" w:after="80"/>
         <w:rPr/>
@@ -4245,7 +4246,7 @@
     <w:p>
       <w:pPr>
         <w:pStyle w:val="Heading1"/>
-        <w:spacing w:before="400" w:after="200"/>
+        <w:spacing w:before="0" w:after="200"/>
         <w:rPr/>
       </w:pPr>
       <w:r>
@@ -4287,7 +4288,7 @@
         <w:pStyle w:val="ListParagraph"/>
         <w:numPr>
           <w:ilvl w:val="0"/>
-          <w:numId w:val="1"/>
+          <w:numId w:val="2"/>
         </w:numPr>
         <w:spacing w:before="0" w:after="80"/>
         <w:rPr/>
@@ -4302,7 +4303,7 @@
         <w:pStyle w:val="ListParagraph"/>
         <w:numPr>
           <w:ilvl w:val="0"/>
-          <w:numId w:val="1"/>
+          <w:numId w:val="2"/>
         </w:numPr>
         <w:spacing w:before="0" w:after="80"/>
         <w:rPr/>
@@ -4317,7 +4318,7 @@
         <w:pStyle w:val="ListParagraph"/>
         <w:numPr>
           <w:ilvl w:val="0"/>
-          <w:numId w:val="1"/>
+          <w:numId w:val="2"/>
         </w:numPr>
         <w:spacing w:before="0" w:after="80"/>
         <w:rPr/>
@@ -4332,7 +4333,7 @@
         <w:pStyle w:val="ListParagraph"/>
         <w:numPr>
           <w:ilvl w:val="0"/>
-          <w:numId w:val="1"/>
+          <w:numId w:val="2"/>
         </w:numPr>
         <w:spacing w:before="0" w:after="80"/>
         <w:rPr/>
@@ -5173,7 +5174,7 @@
         <w:pStyle w:val="ListParagraph"/>
         <w:numPr>
           <w:ilvl w:val="0"/>
-          <w:numId w:val="1"/>
+          <w:numId w:val="2"/>
         </w:numPr>
         <w:spacing w:before="0" w:after="80"/>
         <w:rPr/>
@@ -5188,7 +5189,7 @@
         <w:pStyle w:val="ListParagraph"/>
         <w:numPr>
           <w:ilvl w:val="0"/>
-          <w:numId w:val="1"/>
+          <w:numId w:val="2"/>
         </w:numPr>
         <w:spacing w:before="0" w:after="80"/>
         <w:rPr/>
@@ -5203,7 +5204,7 @@
         <w:pStyle w:val="ListParagraph"/>
         <w:numPr>
           <w:ilvl w:val="0"/>
-          <w:numId w:val="1"/>
+          <w:numId w:val="2"/>
         </w:numPr>
         <w:spacing w:before="0" w:after="80"/>
         <w:rPr/>
@@ -5218,7 +5219,7 @@
         <w:pStyle w:val="ListParagraph"/>
         <w:numPr>
           <w:ilvl w:val="0"/>
-          <w:numId w:val="1"/>
+          <w:numId w:val="2"/>
         </w:numPr>
         <w:spacing w:before="0" w:after="80"/>
         <w:rPr/>
@@ -5398,21 +5399,7 @@
                 <w:sz w:val="20"/>
                 <w:szCs w:val="20"/>
               </w:rPr>
-              <w:t xml:space="preserve">PC </w:t>
-            </w:r>
-            <w:r>
-              <w:rPr>
-                <w:sz w:val="20"/>
-                <w:szCs w:val="20"/>
-              </w:rPr>
-              <w:t>16</w:t>
-            </w:r>
-            <w:r>
-              <w:rPr>
-                <w:sz w:val="20"/>
-                <w:szCs w:val="20"/>
-              </w:rPr>
-              <w:t>Go RAM, SSD, connexion Internet</w:t>
+              <w:t>PC 16Go RAM, SSD, connexion Internet</w:t>
             </w:r>
           </w:p>
         </w:tc>
@@ -6713,16 +6700,16 @@
         <w:rPr/>
       </w:pPr>
       <w:r>
+        <w:rPr/>
+      </w:r>
+      <w:r>
         <w:br w:type="page"/>
       </w:r>
-      <w:r>
-        <w:rPr/>
-      </w:r>
     </w:p>
     <w:p>
       <w:pPr>
         <w:pStyle w:val="Heading1"/>
-        <w:spacing w:before="400" w:after="200"/>
+        <w:spacing w:before="0" w:after="200"/>
         <w:rPr/>
       </w:pPr>
       <w:r>
@@ -6889,14 +6876,7 @@
                 <w:sz w:val="20"/>
                 <w:szCs w:val="20"/>
               </w:rPr>
-              <w:t xml:space="preserve">2 </w:t>
-            </w:r>
-            <w:r>
-              <w:rPr>
-                <w:sz w:val="20"/>
-                <w:szCs w:val="20"/>
-              </w:rPr>
-              <w:t>semaines</w:t>
+              <w:t>2 semaines</w:t>
             </w:r>
           </w:p>
         </w:tc>
@@ -6971,14 +6951,7 @@
                 <w:sz w:val="20"/>
                 <w:szCs w:val="20"/>
               </w:rPr>
-              <w:t xml:space="preserve">2 </w:t>
-            </w:r>
-            <w:r>
-              <w:rPr>
-                <w:sz w:val="20"/>
-                <w:szCs w:val="20"/>
-              </w:rPr>
-              <w:t xml:space="preserve"> semaines</w:t>
+              <w:t>2  semaines</w:t>
             </w:r>
           </w:p>
         </w:tc>
@@ -7053,14 +7026,7 @@
                 <w:sz w:val="20"/>
                 <w:szCs w:val="20"/>
               </w:rPr>
-              <w:t>1</w:t>
-            </w:r>
-            <w:r>
-              <w:rPr>
-                <w:sz w:val="20"/>
-                <w:szCs w:val="20"/>
-              </w:rPr>
-              <w:t xml:space="preserve"> semaines</w:t>
+              <w:t>1 semaines</w:t>
             </w:r>
           </w:p>
         </w:tc>
@@ -7477,21 +7443,7 @@
           <w:sz w:val="22"/>
           <w:szCs w:val="22"/>
         </w:rPr>
-        <w:t xml:space="preserve">Durée totale estimée : </w:t>
-      </w:r>
-      <w:r>
-        <w:rPr>
-          <w:sz w:val="22"/>
-          <w:szCs w:val="22"/>
-        </w:rPr>
-        <w:t>11</w:t>
-      </w:r>
-      <w:r>
-        <w:rPr>
-          <w:sz w:val="22"/>
-          <w:szCs w:val="22"/>
-        </w:rPr>
-        <w:t xml:space="preserve">semaines </w:t>
+        <w:t xml:space="preserve">Durée totale estimée : 11semaines </w:t>
       </w:r>
     </w:p>
     <w:p>
@@ -7510,7 +7462,7 @@
         <w:pStyle w:val="ListParagraph"/>
         <w:numPr>
           <w:ilvl w:val="0"/>
-          <w:numId w:val="1"/>
+          <w:numId w:val="2"/>
         </w:numPr>
         <w:spacing w:before="0" w:after="80"/>
         <w:rPr/>
@@ -7525,7 +7477,7 @@
         <w:pStyle w:val="ListParagraph"/>
         <w:numPr>
           <w:ilvl w:val="0"/>
-          <w:numId w:val="1"/>
+          <w:numId w:val="2"/>
         </w:numPr>
         <w:spacing w:before="0" w:after="80"/>
         <w:rPr/>
@@ -7540,7 +7492,7 @@
         <w:pStyle w:val="ListParagraph"/>
         <w:numPr>
           <w:ilvl w:val="0"/>
-          <w:numId w:val="1"/>
+          <w:numId w:val="2"/>
         </w:numPr>
         <w:spacing w:before="0" w:after="80"/>
         <w:rPr/>
@@ -7555,7 +7507,7 @@
         <w:pStyle w:val="ListParagraph"/>
         <w:numPr>
           <w:ilvl w:val="0"/>
-          <w:numId w:val="1"/>
+          <w:numId w:val="2"/>
         </w:numPr>
         <w:spacing w:before="0" w:after="80"/>
         <w:rPr/>
@@ -7570,7 +7522,7 @@
         <w:pStyle w:val="ListParagraph"/>
         <w:numPr>
           <w:ilvl w:val="0"/>
-          <w:numId w:val="1"/>
+          <w:numId w:val="2"/>
         </w:numPr>
         <w:spacing w:before="0" w:after="80"/>
         <w:rPr/>
@@ -7585,7 +7537,7 @@
         <w:pStyle w:val="ListParagraph"/>
         <w:numPr>
           <w:ilvl w:val="0"/>
-          <w:numId w:val="1"/>
+          <w:numId w:val="2"/>
         </w:numPr>
         <w:spacing w:before="0" w:after="80"/>
         <w:rPr/>
@@ -8090,16 +8042,16 @@
         <w:rPr/>
       </w:pPr>
       <w:r>
+        <w:rPr/>
+      </w:r>
+      <w:r>
         <w:br w:type="page"/>
       </w:r>
-      <w:r>
-        <w:rPr/>
-      </w:r>
     </w:p>
     <w:p>
       <w:pPr>
         <w:pStyle w:val="Heading1"/>
-        <w:spacing w:before="400" w:after="200"/>
+        <w:spacing w:before="0" w:after="200"/>
         <w:rPr/>
       </w:pPr>
       <w:r>
@@ -8139,8 +8091,8 @@
         </w:tblCellMar>
       </w:tblPr>
       <w:tblGrid>
-        <w:gridCol w:w="2076"/>
-        <w:gridCol w:w="1647"/>
+        <w:gridCol w:w="2075"/>
+        <w:gridCol w:w="1648"/>
         <w:gridCol w:w="5303"/>
       </w:tblGrid>
       <w:tr>
@@ -8149,7 +8101,7 @@
         </w:trPr>
         <w:tc>
           <w:tcPr>
-            <w:tcW w:w="2076" w:type="dxa"/>
+            <w:tcW w:w="2075" w:type="dxa"/>
             <w:tcBorders/>
             <w:vAlign w:val="center"/>
           </w:tcPr>
@@ -8166,7 +8118,7 @@
         </w:tc>
         <w:tc>
           <w:tcPr>
-            <w:tcW w:w="1647" w:type="dxa"/>
+            <w:tcW w:w="1648" w:type="dxa"/>
             <w:tcBorders/>
             <w:vAlign w:val="center"/>
           </w:tcPr>
@@ -8203,7 +8155,7 @@
         <w:trPr/>
         <w:tc>
           <w:tcPr>
-            <w:tcW w:w="2076" w:type="dxa"/>
+            <w:tcW w:w="2075" w:type="dxa"/>
             <w:tcBorders/>
             <w:vAlign w:val="center"/>
           </w:tcPr>
@@ -8220,7 +8172,7 @@
         </w:tc>
         <w:tc>
           <w:tcPr>
-            <w:tcW w:w="1647" w:type="dxa"/>
+            <w:tcW w:w="1648" w:type="dxa"/>
             <w:tcBorders/>
             <w:vAlign w:val="center"/>
           </w:tcPr>
@@ -8257,7 +8209,7 @@
         <w:trPr/>
         <w:tc>
           <w:tcPr>
-            <w:tcW w:w="2076" w:type="dxa"/>
+            <w:tcW w:w="2075" w:type="dxa"/>
             <w:tcBorders/>
             <w:vAlign w:val="center"/>
           </w:tcPr>
@@ -8274,7 +8226,7 @@
         </w:tc>
         <w:tc>
           <w:tcPr>
-            <w:tcW w:w="1647" w:type="dxa"/>
+            <w:tcW w:w="1648" w:type="dxa"/>
             <w:tcBorders/>
             <w:vAlign w:val="center"/>
           </w:tcPr>
@@ -8311,7 +8263,7 @@
         <w:trPr/>
         <w:tc>
           <w:tcPr>
-            <w:tcW w:w="2076" w:type="dxa"/>
+            <w:tcW w:w="2075" w:type="dxa"/>
             <w:tcBorders/>
             <w:vAlign w:val="center"/>
           </w:tcPr>
@@ -8328,7 +8280,7 @@
         </w:tc>
         <w:tc>
           <w:tcPr>
-            <w:tcW w:w="1647" w:type="dxa"/>
+            <w:tcW w:w="1648" w:type="dxa"/>
             <w:tcBorders/>
             <w:vAlign w:val="center"/>
           </w:tcPr>
@@ -8365,7 +8317,7 @@
         <w:trPr/>
         <w:tc>
           <w:tcPr>
-            <w:tcW w:w="2076" w:type="dxa"/>
+            <w:tcW w:w="2075" w:type="dxa"/>
             <w:tcBorders/>
             <w:vAlign w:val="center"/>
           </w:tcPr>
@@ -8382,7 +8334,7 @@
         </w:tc>
         <w:tc>
           <w:tcPr>
-            <w:tcW w:w="1647" w:type="dxa"/>
+            <w:tcW w:w="1648" w:type="dxa"/>
             <w:tcBorders/>
             <w:vAlign w:val="center"/>
           </w:tcPr>
@@ -8419,7 +8371,7 @@
         <w:trPr/>
         <w:tc>
           <w:tcPr>
-            <w:tcW w:w="2076" w:type="dxa"/>
+            <w:tcW w:w="2075" w:type="dxa"/>
             <w:tcBorders/>
             <w:vAlign w:val="center"/>
           </w:tcPr>
@@ -8436,7 +8388,7 @@
         </w:tc>
         <w:tc>
           <w:tcPr>
-            <w:tcW w:w="1647" w:type="dxa"/>
+            <w:tcW w:w="1648" w:type="dxa"/>
             <w:tcBorders/>
             <w:vAlign w:val="center"/>
           </w:tcPr>
@@ -8473,7 +8425,7 @@
         <w:trPr/>
         <w:tc>
           <w:tcPr>
-            <w:tcW w:w="2076" w:type="dxa"/>
+            <w:tcW w:w="2075" w:type="dxa"/>
             <w:tcBorders/>
             <w:vAlign w:val="center"/>
           </w:tcPr>
@@ -8492,7 +8444,7 @@
         </w:tc>
         <w:tc>
           <w:tcPr>
-            <w:tcW w:w="1647" w:type="dxa"/>
+            <w:tcW w:w="1648" w:type="dxa"/>
             <w:tcBorders/>
             <w:vAlign w:val="center"/>
           </w:tcPr>
@@ -8566,7 +8518,7 @@
         <w:pStyle w:val="ListParagraph"/>
         <w:numPr>
           <w:ilvl w:val="0"/>
-          <w:numId w:val="1"/>
+          <w:numId w:val="2"/>
         </w:numPr>
         <w:spacing w:before="0" w:after="80"/>
         <w:rPr/>
@@ -8581,7 +8533,7 @@
         <w:pStyle w:val="ListParagraph"/>
         <w:numPr>
           <w:ilvl w:val="0"/>
-          <w:numId w:val="1"/>
+          <w:numId w:val="2"/>
         </w:numPr>
         <w:spacing w:before="0" w:after="80"/>
         <w:rPr/>
@@ -8596,7 +8548,7 @@
         <w:pStyle w:val="ListParagraph"/>
         <w:numPr>
           <w:ilvl w:val="0"/>
-          <w:numId w:val="1"/>
+          <w:numId w:val="2"/>
         </w:numPr>
         <w:spacing w:before="0" w:after="80"/>
         <w:rPr/>
@@ -8611,7 +8563,7 @@
         <w:pStyle w:val="ListParagraph"/>
         <w:numPr>
           <w:ilvl w:val="0"/>
-          <w:numId w:val="1"/>
+          <w:numId w:val="2"/>
         </w:numPr>
         <w:spacing w:before="0" w:after="80"/>
         <w:rPr/>
@@ -8626,7 +8578,7 @@
         <w:pStyle w:val="ListParagraph"/>
         <w:numPr>
           <w:ilvl w:val="0"/>
-          <w:numId w:val="1"/>
+          <w:numId w:val="2"/>
         </w:numPr>
         <w:spacing w:before="0" w:after="80"/>
         <w:rPr/>
@@ -8641,7 +8593,7 @@
         <w:pStyle w:val="ListParagraph"/>
         <w:numPr>
           <w:ilvl w:val="0"/>
-          <w:numId w:val="1"/>
+          <w:numId w:val="2"/>
         </w:numPr>
         <w:spacing w:before="0" w:after="80"/>
         <w:rPr/>
@@ -8656,7 +8608,7 @@
         <w:pStyle w:val="ListParagraph"/>
         <w:numPr>
           <w:ilvl w:val="0"/>
-          <w:numId w:val="1"/>
+          <w:numId w:val="2"/>
         </w:numPr>
         <w:spacing w:before="0" w:after="80"/>
         <w:rPr/>
@@ -8672,6 +8624,7 @@
     <w:p>
       <w:pPr>
         <w:pStyle w:val="Normal"/>
+        <w:spacing w:before="0" w:after="0"/>
         <w:rPr/>
       </w:pPr>
       <w:r>
@@ -8746,7 +8699,7 @@
         <w:pStyle w:val="ListParagraph"/>
         <w:numPr>
           <w:ilvl w:val="0"/>
-          <w:numId w:val="1"/>
+          <w:numId w:val="2"/>
         </w:numPr>
         <w:spacing w:before="0" w:after="80"/>
         <w:rPr/>
@@ -8761,7 +8714,7 @@
         <w:pStyle w:val="ListParagraph"/>
         <w:numPr>
           <w:ilvl w:val="0"/>
-          <w:numId w:val="1"/>
+          <w:numId w:val="2"/>
         </w:numPr>
         <w:spacing w:before="0" w:after="80"/>
         <w:rPr/>
@@ -8776,7 +8729,7 @@
         <w:pStyle w:val="ListParagraph"/>
         <w:numPr>
           <w:ilvl w:val="0"/>
-          <w:numId w:val="1"/>
+          <w:numId w:val="2"/>
         </w:numPr>
         <w:spacing w:before="0" w:after="80"/>
         <w:rPr/>
@@ -8791,7 +8744,7 @@
         <w:pStyle w:val="ListParagraph"/>
         <w:numPr>
           <w:ilvl w:val="0"/>
-          <w:numId w:val="1"/>
+          <w:numId w:val="2"/>
         </w:numPr>
         <w:spacing w:before="0" w:after="80"/>
         <w:rPr/>
@@ -8843,7 +8796,7 @@
         <w:pStyle w:val="ListParagraph"/>
         <w:numPr>
           <w:ilvl w:val="0"/>
-          <w:numId w:val="1"/>
+          <w:numId w:val="2"/>
         </w:numPr>
         <w:spacing w:before="0" w:after="80"/>
         <w:rPr/>
@@ -8858,7 +8811,7 @@
         <w:pStyle w:val="ListParagraph"/>
         <w:numPr>
           <w:ilvl w:val="0"/>
-          <w:numId w:val="1"/>
+          <w:numId w:val="2"/>
         </w:numPr>
         <w:spacing w:before="0" w:after="80"/>
         <w:rPr/>
@@ -8873,7 +8826,7 @@
         <w:pStyle w:val="ListParagraph"/>
         <w:numPr>
           <w:ilvl w:val="0"/>
-          <w:numId w:val="1"/>
+          <w:numId w:val="2"/>
         </w:numPr>
         <w:spacing w:before="0" w:after="80"/>
         <w:rPr/>
@@ -8888,7 +8841,7 @@
         <w:pStyle w:val="ListParagraph"/>
         <w:numPr>
           <w:ilvl w:val="0"/>
-          <w:numId w:val="1"/>
+          <w:numId w:val="2"/>
         </w:numPr>
         <w:spacing w:before="0" w:after="80"/>
         <w:rPr/>
@@ -8930,7 +8883,7 @@
     <w:p>
       <w:pPr>
         <w:pStyle w:val="Heading1"/>
-        <w:spacing w:before="400" w:after="200"/>
+        <w:spacing w:before="0" w:after="200"/>
         <w:rPr/>
       </w:pPr>
       <w:r>
@@ -9004,7 +8957,10 @@
         </w:rPr>
       </w:pPr>
       <w:r>
-        <w:rPr/>
+        <w:rPr>
+          <w:sz w:val="22"/>
+          <w:szCs w:val="22"/>
+        </w:rPr>
       </w:r>
     </w:p>
     <w:p>
@@ -9177,6 +9133,143 @@
   <w:abstractNum w:abstractNumId="2">
     <w:lvl w:ilvl="0">
       <w:start w:val="1"/>
+      <w:numFmt w:val="bullet"/>
+      <w:lvlText w:val=""/>
+      <w:lvlJc w:val="start"/>
+      <w:pPr>
+        <w:tabs>
+          <w:tab w:val="num" w:pos="0"/>
+        </w:tabs>
+        <w:ind w:start="720" w:hanging="360"/>
+      </w:pPr>
+      <w:rPr>
+        <w:rFonts w:ascii="Wingdings" w:hAnsi="Wingdings" w:cs="Wingdings" w:hint="default"/>
+      </w:rPr>
+    </w:lvl>
+    <w:lvl w:ilvl="1">
+      <w:start w:val="1"/>
+      <w:numFmt w:val="bullet"/>
+      <w:lvlText w:val=""/>
+      <w:lvlJc w:val="start"/>
+      <w:pPr>
+        <w:tabs>
+          <w:tab w:val="num" w:pos="0"/>
+        </w:tabs>
+        <w:ind w:start="1440" w:hanging="360"/>
+      </w:pPr>
+      <w:rPr>
+        <w:rFonts w:ascii="Wingdings 2" w:hAnsi="Wingdings 2" w:cs="Wingdings 2" w:hint="default"/>
+      </w:rPr>
+    </w:lvl>
+    <w:lvl w:ilvl="2">
+      <w:start w:val="1"/>
+      <w:numFmt w:val="bullet"/>
+      <w:lvlText w:val="■"/>
+      <w:lvlJc w:val="start"/>
+      <w:pPr>
+        <w:tabs>
+          <w:tab w:val="num" w:pos="0"/>
+        </w:tabs>
+        <w:ind w:start="2160" w:hanging="360"/>
+      </w:pPr>
+      <w:rPr>
+        <w:rFonts w:ascii="OpenSymbol" w:hAnsi="OpenSymbol" w:cs="OpenSymbol" w:hint="default"/>
+      </w:rPr>
+    </w:lvl>
+    <w:lvl w:ilvl="3">
+      <w:start w:val="1"/>
+      <w:numFmt w:val="bullet"/>
+      <w:lvlText w:val=""/>
+      <w:lvlJc w:val="start"/>
+      <w:pPr>
+        <w:tabs>
+          <w:tab w:val="num" w:pos="0"/>
+        </w:tabs>
+        <w:ind w:start="2880" w:hanging="360"/>
+      </w:pPr>
+      <w:rPr>
+        <w:rFonts w:ascii="Wingdings" w:hAnsi="Wingdings" w:cs="Wingdings" w:hint="default"/>
+      </w:rPr>
+    </w:lvl>
+    <w:lvl w:ilvl="4">
+      <w:start w:val="1"/>
+      <w:numFmt w:val="bullet"/>
+      <w:lvlText w:val=""/>
+      <w:lvlJc w:val="start"/>
+      <w:pPr>
+        <w:tabs>
+          <w:tab w:val="num" w:pos="0"/>
+        </w:tabs>
+        <w:ind w:start="3600" w:hanging="360"/>
+      </w:pPr>
+      <w:rPr>
+        <w:rFonts w:ascii="Wingdings 2" w:hAnsi="Wingdings 2" w:cs="Wingdings 2" w:hint="default"/>
+      </w:rPr>
+    </w:lvl>
+    <w:lvl w:ilvl="5">
+      <w:start w:val="1"/>
+      <w:numFmt w:val="bullet"/>
+      <w:lvlText w:val="■"/>
+      <w:lvlJc w:val="start"/>
+      <w:pPr>
+        <w:tabs>
+          <w:tab w:val="num" w:pos="0"/>
+        </w:tabs>
+        <w:ind w:start="4320" w:hanging="360"/>
+      </w:pPr>
+      <w:rPr>
+        <w:rFonts w:ascii="OpenSymbol" w:hAnsi="OpenSymbol" w:cs="OpenSymbol" w:hint="default"/>
+      </w:rPr>
+    </w:lvl>
+    <w:lvl w:ilvl="6">
+      <w:start w:val="1"/>
+      <w:numFmt w:val="bullet"/>
+      <w:lvlText w:val=""/>
+      <w:lvlJc w:val="start"/>
+      <w:pPr>
+        <w:tabs>
+          <w:tab w:val="num" w:pos="0"/>
+        </w:tabs>
+        <w:ind w:start="5040" w:hanging="360"/>
+      </w:pPr>
+      <w:rPr>
+        <w:rFonts w:ascii="Wingdings" w:hAnsi="Wingdings" w:cs="Wingdings" w:hint="default"/>
+      </w:rPr>
+    </w:lvl>
+    <w:lvl w:ilvl="7">
+      <w:start w:val="1"/>
+      <w:numFmt w:val="bullet"/>
+      <w:lvlText w:val=""/>
+      <w:lvlJc w:val="start"/>
+      <w:pPr>
+        <w:tabs>
+          <w:tab w:val="num" w:pos="0"/>
+        </w:tabs>
+        <w:ind w:start="5760" w:hanging="360"/>
+      </w:pPr>
+      <w:rPr>
+        <w:rFonts w:ascii="Wingdings" w:hAnsi="Wingdings" w:cs="Wingdings" w:hint="default"/>
+      </w:rPr>
+    </w:lvl>
+    <w:lvl w:ilvl="8">
+      <w:start w:val="1"/>
+      <w:numFmt w:val="bullet"/>
+      <w:lvlText w:val=""/>
+      <w:lvlJc w:val="start"/>
+      <w:pPr>
+        <w:tabs>
+          <w:tab w:val="num" w:pos="0"/>
+        </w:tabs>
+        <w:ind w:start="6480" w:hanging="360"/>
+      </w:pPr>
+      <w:rPr>
+        <w:rFonts w:ascii="Wingdings" w:hAnsi="Wingdings" w:cs="Wingdings" w:hint="default"/>
+      </w:rPr>
+    </w:lvl>
+  </w:abstractNum>
+  <w:abstractNum w:abstractNumId="3">
+    <w:lvl w:ilvl="0">
+      <w:start w:val="1"/>
       <w:numFmt w:val="none"/>
       <w:suff w:val="nothing"/>
       <w:lvlText w:val=""/>
@@ -9300,7 +9393,10 @@
     <w:abstractNumId w:val="2"/>
   </w:num>
   <w:num w:numId="3">
-    <w:abstractNumId w:val="1"/>
+    <w:abstractNumId w:val="3"/>
+  </w:num>
+  <w:num w:numId="4">
+    <w:abstractNumId w:val="2"/>
     <w:lvlOverride w:ilvl="0">
       <w:startOverride w:val="1"/>
     </w:lvlOverride>
@@ -9328,6 +9424,7 @@
     <w:qFormat/>
     <w:pPr>
       <w:widowControl/>
+      <w:suppressAutoHyphens w:val="true"/>
       <w:bidi w:val="0"/>
       <w:spacing w:before="0" w:after="0"/>
       <w:jc w:val="start"/>
@@ -9422,6 +9519,13 @@
       <w:vertAlign w:val="superscript"/>
     </w:rPr>
   </w:style>
+  <w:style w:type="character" w:styleId="Caractresdenotedebasdepageuser">
+    <w:name w:val="Caractères de note de bas de page (user)"/>
+    <w:qFormat/>
+    <w:rPr>
+      <w:vertAlign w:val="superscript"/>
+    </w:rPr>
+  </w:style>
   <w:style w:type="character" w:styleId="FootnoteReference">
     <w:name w:val="footnote reference"/>
     <w:rPr>
@@ -9444,6 +9548,13 @@
     <w:uiPriority w:val="99"/>
     <w:semiHidden/>
     <w:unhideWhenUsed/>
+    <w:qFormat/>
+    <w:rPr>
+      <w:vertAlign w:val="superscript"/>
+    </w:rPr>
+  </w:style>
+  <w:style w:type="character" w:styleId="Caractresdenotedefinuser">
+    <w:name w:val="Caractères de note de fin (user)"/>
     <w:qFormat/>
     <w:rPr>
       <w:vertAlign w:val="superscript"/>
@@ -9532,6 +9643,21 @@
       <w:rFonts w:cs="Noto Sans Devanagari"/>
     </w:rPr>
   </w:style>
+  <w:style w:type="paragraph" w:styleId="Titreuser">
+    <w:name w:val="Titre (user)"/>
+    <w:basedOn w:val="Normal"/>
+    <w:next w:val="BodyText"/>
+    <w:qFormat/>
+    <w:pPr>
+      <w:keepNext w:val="true"/>
+      <w:spacing w:before="240" w:after="120"/>
+    </w:pPr>
+    <w:rPr>
+      <w:rFonts w:ascii="Liberation Sans" w:hAnsi="Liberation Sans" w:eastAsia="Noto Sans CJK SC" w:cs="Noto Sans Devanagari"/>
+      <w:sz w:val="28"/>
+      <w:szCs w:val="28"/>
+    </w:rPr>
+  </w:style>
   <w:style w:type="paragraph" w:styleId="Title">
     <w:name w:val="Title"/>
     <w:basedOn w:val="Titre"/>
@@ -9547,6 +9673,7 @@
     <w:qFormat/>
     <w:pPr>
       <w:widowControl/>
+      <w:suppressAutoHyphens w:val="true"/>
       <w:bidi w:val="0"/>
       <w:spacing w:before="0" w:after="0"/>
       <w:jc w:val="start"/>
@@ -9567,6 +9694,7 @@
     <w:qFormat/>
     <w:pPr>
       <w:widowControl/>
+      <w:suppressAutoHyphens w:val="true"/>
       <w:bidi w:val="0"/>
       <w:spacing w:before="0" w:after="0"/>
       <w:jc w:val="start"/>

</xml_diff>